<commit_message>
docs: Ay 2 - 1. Hafta raporu güncellendi
LeetCode 2956 çözümü, teknik makale özeti ve gün gün görev dağılımı rapora eklendi.
</commit_message>
<xml_diff>
--- a/Ay2_Hafta1_Rapor.docx
+++ b/Ay2_Hafta1_Rapor.docx
@@ -20,27 +20,34 @@
           <w:sz w:val="32"/>
           <w:szCs w:val="32"/>
         </w:rPr>
-        <w:t xml:space="preserve">Ay </w:t>
-      </w:r>
-      <w:proofErr w:type="gramStart"/>
-      <w:r>
-        <w:rPr>
-          <w:b/>
-          <w:bCs/>
-          <w:sz w:val="32"/>
-          <w:szCs w:val="32"/>
-        </w:rPr>
-        <w:t>2  1.</w:t>
-      </w:r>
-      <w:proofErr w:type="gramEnd"/>
-      <w:r>
-        <w:rPr>
-          <w:b/>
-          <w:bCs/>
-          <w:sz w:val="32"/>
-          <w:szCs w:val="32"/>
-        </w:rPr>
-        <w:t xml:space="preserve"> Hafta Çalışma Raporu</w:t>
+        <w:t>Ay 2  1. Hafta Çalışma Raporu</w:t>
+      </w:r>
+    </w:p>
+    <w:p>
+      <w:pPr>
+        <w:pStyle w:val="Balk1"/>
+        <w:numPr>
+          <w:ilvl w:val="0"/>
+          <w:numId w:val="2"/>
+        </w:numPr>
+        <w:spacing w:before="300" w:after="150"/>
+        <w:rPr>
+          <w:b/>
+          <w:bCs/>
+          <w:color w:val="000000" w:themeColor="text1"/>
+          <w:sz w:val="28"/>
+          <w:szCs w:val="28"/>
+        </w:rPr>
+      </w:pPr>
+      <w:r>
+        <w:rPr>
+          <w:b/>
+          <w:bCs/>
+          <w:color w:val="000000" w:themeColor="text1"/>
+          <w:sz w:val="28"/>
+          <w:szCs w:val="28"/>
+        </w:rPr>
+        <w:t>Tamamlanan Görevler</w:t>
       </w:r>
     </w:p>
     <w:p>
@@ -48,16 +55,32 @@
         <w:pStyle w:val="Balk1"/>
         <w:spacing w:before="300" w:after="150"/>
         <w:rPr>
-          <w:sz w:val="22"/>
-          <w:szCs w:val="22"/>
-        </w:rPr>
-      </w:pPr>
-      <w:r>
-        <w:rPr>
-          <w:sz w:val="22"/>
-          <w:szCs w:val="22"/>
-        </w:rPr>
-        <w:t>1. Tamamlanan Görevler</w:t>
+          <w:b/>
+          <w:bCs/>
+          <w:color w:val="000000" w:themeColor="text1"/>
+          <w:sz w:val="22"/>
+          <w:szCs w:val="22"/>
+        </w:rPr>
+      </w:pPr>
+      <w:r>
+        <w:rPr>
+          <w:b/>
+          <w:bCs/>
+          <w:color w:val="000000" w:themeColor="text1"/>
+          <w:sz w:val="22"/>
+          <w:szCs w:val="22"/>
+        </w:rPr>
+        <w:t>Pazartes</w:t>
+      </w:r>
+      <w:r>
+        <w:rPr>
+          <w:b/>
+          <w:bCs/>
+          <w:color w:val="000000" w:themeColor="text1"/>
+          <w:sz w:val="22"/>
+          <w:szCs w:val="22"/>
+        </w:rPr>
+        <w:t>i-Salı</w:t>
       </w:r>
     </w:p>
     <w:p>
@@ -182,6 +205,37 @@
     <w:p>
       <w:pPr>
         <w:rPr>
+          <w:b/>
+          <w:bCs/>
+          <w:color w:val="000000" w:themeColor="text1"/>
+          <w:sz w:val="22"/>
+          <w:szCs w:val="22"/>
+        </w:rPr>
+      </w:pPr>
+      <w:r>
+        <w:rPr>
+          <w:b/>
+          <w:bCs/>
+          <w:color w:val="000000" w:themeColor="text1"/>
+          <w:sz w:val="22"/>
+          <w:szCs w:val="22"/>
+        </w:rPr>
+        <w:t>Çarşamba</w:t>
+      </w:r>
+      <w:r>
+        <w:rPr>
+          <w:b/>
+          <w:bCs/>
+          <w:color w:val="000000" w:themeColor="text1"/>
+          <w:sz w:val="22"/>
+          <w:szCs w:val="22"/>
+        </w:rPr>
+        <w:t>-Perşembe</w:t>
+      </w:r>
+    </w:p>
+    <w:p>
+      <w:pPr>
+        <w:rPr>
           <w:sz w:val="22"/>
           <w:szCs w:val="22"/>
         </w:rPr>
@@ -238,23 +292,7 @@
           <w:sz w:val="22"/>
           <w:szCs w:val="22"/>
         </w:rPr>
-        <w:t xml:space="preserve">-in </w:t>
-      </w:r>
-      <w:proofErr w:type="gramStart"/>
-      <w:r>
-        <w:rPr>
-          <w:sz w:val="22"/>
-          <w:szCs w:val="22"/>
-        </w:rPr>
-        <w:t>id(</w:t>
-      </w:r>
-      <w:proofErr w:type="gramEnd"/>
-      <w:r>
-        <w:rPr>
-          <w:sz w:val="22"/>
-          <w:szCs w:val="22"/>
-        </w:rPr>
-        <w:t>) fonksiyonuyla çakıştığı için '</w:t>
+        <w:t>-in id() fonksiyonuyla çakıştığı için '</w:t>
       </w:r>
       <w:proofErr w:type="spellStart"/>
       <w:r>
@@ -411,23 +449,7 @@
           <w:sz w:val="22"/>
           <w:szCs w:val="22"/>
         </w:rPr>
-        <w:t xml:space="preserve">) birbirinden ayrıldı; fonksiyonlar artık sonuç döndürüyor, yazdırma </w:t>
-      </w:r>
-      <w:proofErr w:type="gramStart"/>
-      <w:r>
-        <w:rPr>
-          <w:sz w:val="22"/>
-          <w:szCs w:val="22"/>
-        </w:rPr>
-        <w:t>main(</w:t>
-      </w:r>
-      <w:proofErr w:type="gramEnd"/>
-      <w:r>
-        <w:rPr>
-          <w:sz w:val="22"/>
-          <w:szCs w:val="22"/>
-        </w:rPr>
-        <w:t>) içinde yapılıyor.</w:t>
+        <w:t>) birbirinden ayrıldı; fonksiyonlar artık sonuç döndürüyor, yazdırma main() içinde yapılıyor.</w:t>
       </w:r>
     </w:p>
     <w:p>
@@ -482,40 +504,43 @@
           <w:sz w:val="22"/>
           <w:szCs w:val="22"/>
         </w:rPr>
-        <w:t>gorev_</w:t>
-      </w:r>
-      <w:proofErr w:type="gramStart"/>
-      <w:r>
-        <w:rPr>
-          <w:sz w:val="22"/>
-          <w:szCs w:val="22"/>
-        </w:rPr>
-        <w:t>bul</w:t>
-      </w:r>
-      <w:proofErr w:type="spellEnd"/>
-      <w:r>
-        <w:rPr>
-          <w:sz w:val="22"/>
-          <w:szCs w:val="22"/>
-        </w:rPr>
-        <w:t>(</w:t>
-      </w:r>
-      <w:proofErr w:type="gramEnd"/>
-      <w:r>
-        <w:rPr>
-          <w:sz w:val="22"/>
-          <w:szCs w:val="22"/>
-        </w:rPr>
-        <w:t>) fonksiyonuna taşındı.</w:t>
-      </w:r>
-    </w:p>
-    <w:p>
-      <w:pPr>
-        <w:rPr>
-          <w:sz w:val="22"/>
-          <w:szCs w:val="22"/>
-        </w:rPr>
-      </w:pPr>
+        <w:t>gorev_bul</w:t>
+      </w:r>
+      <w:proofErr w:type="spellEnd"/>
+      <w:r>
+        <w:rPr>
+          <w:sz w:val="22"/>
+          <w:szCs w:val="22"/>
+        </w:rPr>
+        <w:t>() fonksiyonuna taşındı.</w:t>
+      </w:r>
+    </w:p>
+    <w:p>
+      <w:pPr>
+        <w:rPr>
+          <w:sz w:val="22"/>
+          <w:szCs w:val="22"/>
+        </w:rPr>
+      </w:pPr>
+    </w:p>
+    <w:p>
+      <w:pPr>
+        <w:rPr>
+          <w:b/>
+          <w:bCs/>
+          <w:sz w:val="22"/>
+          <w:szCs w:val="22"/>
+        </w:rPr>
+      </w:pPr>
+      <w:r>
+        <w:rPr>
+          <w:b/>
+          <w:bCs/>
+          <w:sz w:val="22"/>
+          <w:szCs w:val="22"/>
+        </w:rPr>
+        <w:t>Cuma</w:t>
+      </w:r>
     </w:p>
     <w:p>
       <w:pPr>
@@ -561,23 +586,7 @@
           <w:sz w:val="22"/>
           <w:szCs w:val="22"/>
         </w:rPr>
-        <w:t xml:space="preserve"> (Robert C. </w:t>
-      </w:r>
-      <w:proofErr w:type="gramStart"/>
-      <w:r>
-        <w:rPr>
-          <w:sz w:val="22"/>
-          <w:szCs w:val="22"/>
-        </w:rPr>
-        <w:t>Martin</w:t>
-      </w:r>
-      <w:proofErr w:type="gramEnd"/>
-      <w:r>
-        <w:rPr>
-          <w:sz w:val="22"/>
-          <w:szCs w:val="22"/>
-        </w:rPr>
-        <w:t xml:space="preserve">) kitabının önsözü (James O. </w:t>
+        <w:t xml:space="preserve"> (Robert C. Martin) kitabının önsözü (James O. </w:t>
       </w:r>
       <w:proofErr w:type="spellStart"/>
       <w:r>
@@ -632,17 +641,17 @@
           <w:sz w:val="22"/>
           <w:szCs w:val="22"/>
         </w:rPr>
-        <w:t xml:space="preserve">: </w:t>
-      </w:r>
-      <w:proofErr w:type="gramStart"/>
-      <w:r>
-        <w:rPr>
-          <w:sz w:val="22"/>
-          <w:szCs w:val="22"/>
-        </w:rPr>
-        <w:t>2769 -</w:t>
-      </w:r>
-      <w:proofErr w:type="gramEnd"/>
+        <w:t xml:space="preserve">: 2769 - </w:t>
+      </w:r>
+      <w:proofErr w:type="spellStart"/>
+      <w:r>
+        <w:rPr>
+          <w:sz w:val="22"/>
+          <w:szCs w:val="22"/>
+        </w:rPr>
+        <w:t>Find</w:t>
+      </w:r>
+      <w:proofErr w:type="spellEnd"/>
       <w:r>
         <w:rPr>
           <w:sz w:val="22"/>
@@ -656,6 +665,128 @@
           <w:sz w:val="22"/>
           <w:szCs w:val="22"/>
         </w:rPr>
+        <w:t>the</w:t>
+      </w:r>
+      <w:proofErr w:type="spellEnd"/>
+      <w:r>
+        <w:rPr>
+          <w:sz w:val="22"/>
+          <w:szCs w:val="22"/>
+        </w:rPr>
+        <w:t xml:space="preserve"> Maximum </w:t>
+      </w:r>
+      <w:proofErr w:type="spellStart"/>
+      <w:r>
+        <w:rPr>
+          <w:sz w:val="22"/>
+          <w:szCs w:val="22"/>
+        </w:rPr>
+        <w:t>Achievable</w:t>
+      </w:r>
+      <w:proofErr w:type="spellEnd"/>
+      <w:r>
+        <w:rPr>
+          <w:sz w:val="22"/>
+          <w:szCs w:val="22"/>
+        </w:rPr>
+        <w:t xml:space="preserve"> </w:t>
+      </w:r>
+      <w:proofErr w:type="spellStart"/>
+      <w:r>
+        <w:rPr>
+          <w:sz w:val="22"/>
+          <w:szCs w:val="22"/>
+        </w:rPr>
+        <w:t>Number</w:t>
+      </w:r>
+      <w:proofErr w:type="spellEnd"/>
+      <w:r>
+        <w:rPr>
+          <w:sz w:val="22"/>
+          <w:szCs w:val="22"/>
+        </w:rPr>
+        <w:t xml:space="preserve"> problemi çözüldü, </w:t>
+      </w:r>
+      <w:proofErr w:type="spellStart"/>
+      <w:r>
+        <w:rPr>
+          <w:sz w:val="22"/>
+          <w:szCs w:val="22"/>
+        </w:rPr>
+        <w:t>Big</w:t>
+      </w:r>
+      <w:proofErr w:type="spellEnd"/>
+      <w:r>
+        <w:rPr>
+          <w:sz w:val="22"/>
+          <w:szCs w:val="22"/>
+        </w:rPr>
+        <w:t>-O analizi yapıldı.</w:t>
+      </w:r>
+    </w:p>
+    <w:p>
+      <w:pPr>
+        <w:rPr>
+          <w:sz w:val="22"/>
+          <w:szCs w:val="22"/>
+        </w:rPr>
+      </w:pPr>
+    </w:p>
+    <w:p>
+      <w:pPr>
+        <w:rPr>
+          <w:b/>
+          <w:bCs/>
+          <w:sz w:val="22"/>
+          <w:szCs w:val="22"/>
+        </w:rPr>
+      </w:pPr>
+      <w:r>
+        <w:rPr>
+          <w:b/>
+          <w:bCs/>
+          <w:sz w:val="22"/>
+          <w:szCs w:val="22"/>
+        </w:rPr>
+        <w:t>Cumartesi</w:t>
+      </w:r>
+    </w:p>
+    <w:p>
+      <w:pPr>
+        <w:rPr>
+          <w:sz w:val="22"/>
+          <w:szCs w:val="22"/>
+        </w:rPr>
+      </w:pPr>
+      <w:r>
+        <w:rPr>
+          <w:sz w:val="22"/>
+          <w:szCs w:val="22"/>
+        </w:rPr>
+        <w:t xml:space="preserve">- </w:t>
+      </w:r>
+      <w:proofErr w:type="spellStart"/>
+      <w:r>
+        <w:rPr>
+          <w:sz w:val="22"/>
+          <w:szCs w:val="22"/>
+        </w:rPr>
+        <w:t>LeetCode</w:t>
+      </w:r>
+      <w:proofErr w:type="spellEnd"/>
+      <w:r>
+        <w:rPr>
+          <w:sz w:val="22"/>
+          <w:szCs w:val="22"/>
+        </w:rPr>
+        <w:t xml:space="preserve"> 2956 - </w:t>
+      </w:r>
+      <w:proofErr w:type="spellStart"/>
+      <w:r>
+        <w:rPr>
+          <w:sz w:val="22"/>
+          <w:szCs w:val="22"/>
+        </w:rPr>
         <w:t>Find</w:t>
       </w:r>
       <w:proofErr w:type="spellEnd"/>
@@ -672,23 +803,7 @@
           <w:sz w:val="22"/>
           <w:szCs w:val="22"/>
         </w:rPr>
-        <w:t>the</w:t>
-      </w:r>
-      <w:proofErr w:type="spellEnd"/>
-      <w:r>
-        <w:rPr>
-          <w:sz w:val="22"/>
-          <w:szCs w:val="22"/>
-        </w:rPr>
-        <w:t xml:space="preserve"> Maximum </w:t>
-      </w:r>
-      <w:proofErr w:type="spellStart"/>
-      <w:r>
-        <w:rPr>
-          <w:sz w:val="22"/>
-          <w:szCs w:val="22"/>
-        </w:rPr>
-        <w:t>Achievable</w:t>
+        <w:t>Common</w:t>
       </w:r>
       <w:proofErr w:type="spellEnd"/>
       <w:r>
@@ -704,31 +819,132 @@
           <w:sz w:val="22"/>
           <w:szCs w:val="22"/>
         </w:rPr>
-        <w:t>Number</w:t>
-      </w:r>
-      <w:proofErr w:type="spellEnd"/>
-      <w:r>
-        <w:rPr>
-          <w:sz w:val="22"/>
-          <w:szCs w:val="22"/>
-        </w:rPr>
-        <w:t xml:space="preserve"> problemi çözüldü, </w:t>
-      </w:r>
-      <w:proofErr w:type="spellStart"/>
-      <w:r>
-        <w:rPr>
-          <w:sz w:val="22"/>
-          <w:szCs w:val="22"/>
-        </w:rPr>
-        <w:t>Big</w:t>
-      </w:r>
-      <w:proofErr w:type="spellEnd"/>
-      <w:r>
-        <w:rPr>
-          <w:sz w:val="22"/>
-          <w:szCs w:val="22"/>
-        </w:rPr>
-        <w:t>-O analizi yapıldı.</w:t>
+        <w:t>Elements</w:t>
+      </w:r>
+      <w:proofErr w:type="spellEnd"/>
+      <w:r>
+        <w:rPr>
+          <w:sz w:val="22"/>
+          <w:szCs w:val="22"/>
+        </w:rPr>
+        <w:t xml:space="preserve"> </w:t>
+      </w:r>
+      <w:proofErr w:type="spellStart"/>
+      <w:r>
+        <w:rPr>
+          <w:sz w:val="22"/>
+          <w:szCs w:val="22"/>
+        </w:rPr>
+        <w:t>Between</w:t>
+      </w:r>
+      <w:proofErr w:type="spellEnd"/>
+      <w:r>
+        <w:rPr>
+          <w:sz w:val="22"/>
+          <w:szCs w:val="22"/>
+        </w:rPr>
+        <w:t xml:space="preserve"> Two </w:t>
+      </w:r>
+      <w:proofErr w:type="spellStart"/>
+      <w:r>
+        <w:rPr>
+          <w:sz w:val="22"/>
+          <w:szCs w:val="22"/>
+        </w:rPr>
+        <w:t>Arrays</w:t>
+      </w:r>
+      <w:proofErr w:type="spellEnd"/>
+      <w:r>
+        <w:rPr>
+          <w:sz w:val="22"/>
+          <w:szCs w:val="22"/>
+        </w:rPr>
+        <w:t xml:space="preserve"> çözüldü (O(</w:t>
+      </w:r>
+      <w:proofErr w:type="spellStart"/>
+      <w:r>
+        <w:rPr>
+          <w:sz w:val="22"/>
+          <w:szCs w:val="22"/>
+        </w:rPr>
+        <w:t>n×m</w:t>
+      </w:r>
+      <w:proofErr w:type="spellEnd"/>
+      <w:r>
+        <w:rPr>
+          <w:sz w:val="22"/>
+          <w:szCs w:val="22"/>
+        </w:rPr>
+        <w:t>) zaman, O(1) alan)</w:t>
+      </w:r>
+    </w:p>
+    <w:p>
+      <w:pPr>
+        <w:rPr>
+          <w:sz w:val="22"/>
+          <w:szCs w:val="22"/>
+        </w:rPr>
+      </w:pPr>
+    </w:p>
+    <w:p>
+      <w:pPr>
+        <w:rPr>
+          <w:sz w:val="22"/>
+          <w:szCs w:val="22"/>
+        </w:rPr>
+      </w:pPr>
+      <w:r>
+        <w:rPr>
+          <w:sz w:val="22"/>
+          <w:szCs w:val="22"/>
+        </w:rPr>
+        <w:t xml:space="preserve">- </w:t>
+      </w:r>
+      <w:r>
+        <w:rPr>
+          <w:sz w:val="22"/>
+          <w:szCs w:val="22"/>
+        </w:rPr>
+        <w:t>Teknik makale okundu: "</w:t>
+      </w:r>
+      <w:proofErr w:type="spellStart"/>
+      <w:r>
+        <w:rPr>
+          <w:sz w:val="22"/>
+          <w:szCs w:val="22"/>
+        </w:rPr>
+        <w:t>List</w:t>
+      </w:r>
+      <w:proofErr w:type="spellEnd"/>
+      <w:r>
+        <w:rPr>
+          <w:sz w:val="22"/>
+          <w:szCs w:val="22"/>
+        </w:rPr>
+        <w:t xml:space="preserve"> </w:t>
+      </w:r>
+      <w:proofErr w:type="spellStart"/>
+      <w:r>
+        <w:rPr>
+          <w:sz w:val="22"/>
+          <w:szCs w:val="22"/>
+        </w:rPr>
+        <w:t>Comprehensions</w:t>
+      </w:r>
+      <w:proofErr w:type="spellEnd"/>
+      <w:r>
+        <w:rPr>
+          <w:sz w:val="22"/>
+          <w:szCs w:val="22"/>
+        </w:rPr>
+        <w:t xml:space="preserve"> in Python" özet çıkarıldı</w:t>
+      </w:r>
+      <w:r>
+        <w:rPr>
+          <w:sz w:val="22"/>
+          <w:szCs w:val="22"/>
+        </w:rPr>
+        <w:t>.</w:t>
       </w:r>
     </w:p>
     <w:p>
@@ -740,26 +956,58 @@
           <w:szCs w:val="22"/>
         </w:rPr>
       </w:pPr>
-      <w:r>
-        <w:rPr>
-          <w:sz w:val="22"/>
-          <w:szCs w:val="22"/>
-        </w:rPr>
-        <w:t xml:space="preserve">2. </w:t>
-      </w:r>
-      <w:proofErr w:type="spellStart"/>
-      <w:r>
-        <w:rPr>
-          <w:sz w:val="22"/>
-          <w:szCs w:val="22"/>
-        </w:rPr>
-        <w:t>LeetCode</w:t>
-      </w:r>
-      <w:proofErr w:type="spellEnd"/>
-      <w:r>
-        <w:rPr>
-          <w:sz w:val="22"/>
-          <w:szCs w:val="22"/>
+    </w:p>
+    <w:p>
+      <w:pPr>
+        <w:pStyle w:val="Balk1"/>
+        <w:spacing w:before="300" w:after="150"/>
+        <w:rPr>
+          <w:sz w:val="22"/>
+          <w:szCs w:val="22"/>
+        </w:rPr>
+      </w:pPr>
+    </w:p>
+    <w:p>
+      <w:pPr>
+        <w:pStyle w:val="Balk1"/>
+        <w:spacing w:before="300" w:after="150"/>
+        <w:rPr>
+          <w:b/>
+          <w:bCs/>
+          <w:color w:val="000000" w:themeColor="text1"/>
+          <w:sz w:val="28"/>
+          <w:szCs w:val="28"/>
+        </w:rPr>
+      </w:pPr>
+      <w:r>
+        <w:rPr>
+          <w:b/>
+          <w:bCs/>
+          <w:color w:val="000000" w:themeColor="text1"/>
+          <w:sz w:val="28"/>
+          <w:szCs w:val="28"/>
+        </w:rPr>
+        <w:t>2. L</w:t>
+      </w:r>
+      <w:proofErr w:type="spellStart"/>
+      <w:r>
+        <w:rPr>
+          <w:b/>
+          <w:bCs/>
+          <w:color w:val="000000" w:themeColor="text1"/>
+          <w:sz w:val="28"/>
+          <w:szCs w:val="28"/>
+        </w:rPr>
+        <w:t>eetCode</w:t>
+      </w:r>
+      <w:proofErr w:type="spellEnd"/>
+      <w:r>
+        <w:rPr>
+          <w:b/>
+          <w:bCs/>
+          <w:color w:val="000000" w:themeColor="text1"/>
+          <w:sz w:val="28"/>
+          <w:szCs w:val="28"/>
         </w:rPr>
         <w:t xml:space="preserve"> Çözümleri</w:t>
       </w:r>
@@ -769,12 +1017,18 @@
         <w:pStyle w:val="Balk2"/>
         <w:spacing w:before="200" w:after="100"/>
         <w:rPr>
-          <w:sz w:val="22"/>
-          <w:szCs w:val="22"/>
-        </w:rPr>
-      </w:pPr>
-      <w:r>
-        <w:rPr>
+          <w:b/>
+          <w:bCs/>
+          <w:color w:val="000000" w:themeColor="text1"/>
+          <w:sz w:val="22"/>
+          <w:szCs w:val="22"/>
+        </w:rPr>
+      </w:pPr>
+      <w:r>
+        <w:rPr>
+          <w:b/>
+          <w:bCs/>
+          <w:color w:val="000000" w:themeColor="text1"/>
           <w:sz w:val="22"/>
           <w:szCs w:val="22"/>
         </w:rPr>
@@ -783,6 +1037,9 @@
       <w:proofErr w:type="spellStart"/>
       <w:r>
         <w:rPr>
+          <w:b/>
+          <w:bCs/>
+          <w:color w:val="000000" w:themeColor="text1"/>
           <w:sz w:val="22"/>
           <w:szCs w:val="22"/>
         </w:rPr>
@@ -791,6 +1048,9 @@
       <w:proofErr w:type="spellEnd"/>
       <w:r>
         <w:rPr>
+          <w:b/>
+          <w:bCs/>
+          <w:color w:val="000000" w:themeColor="text1"/>
           <w:sz w:val="22"/>
           <w:szCs w:val="22"/>
         </w:rPr>
@@ -799,6 +1059,9 @@
       <w:proofErr w:type="spellStart"/>
       <w:r>
         <w:rPr>
+          <w:b/>
+          <w:bCs/>
+          <w:color w:val="000000" w:themeColor="text1"/>
           <w:sz w:val="22"/>
           <w:szCs w:val="22"/>
         </w:rPr>
@@ -807,6 +1070,9 @@
       <w:proofErr w:type="spellEnd"/>
       <w:r>
         <w:rPr>
+          <w:b/>
+          <w:bCs/>
+          <w:color w:val="000000" w:themeColor="text1"/>
           <w:sz w:val="22"/>
           <w:szCs w:val="22"/>
         </w:rPr>
@@ -815,6 +1081,9 @@
       <w:proofErr w:type="spellStart"/>
       <w:r>
         <w:rPr>
+          <w:b/>
+          <w:bCs/>
+          <w:color w:val="000000" w:themeColor="text1"/>
           <w:sz w:val="22"/>
           <w:szCs w:val="22"/>
         </w:rPr>
@@ -823,6 +1092,9 @@
       <w:proofErr w:type="spellEnd"/>
       <w:r>
         <w:rPr>
+          <w:b/>
+          <w:bCs/>
+          <w:color w:val="000000" w:themeColor="text1"/>
           <w:sz w:val="22"/>
           <w:szCs w:val="22"/>
         </w:rPr>
@@ -831,6 +1103,9 @@
       <w:proofErr w:type="spellStart"/>
       <w:r>
         <w:rPr>
+          <w:b/>
+          <w:bCs/>
+          <w:color w:val="000000" w:themeColor="text1"/>
           <w:sz w:val="22"/>
           <w:szCs w:val="22"/>
         </w:rPr>
@@ -945,23 +1220,7 @@
           <w:sz w:val="22"/>
           <w:szCs w:val="22"/>
         </w:rPr>
-        <w:t xml:space="preserve">Zaman Karmaşıklığı: </w:t>
-      </w:r>
-      <w:proofErr w:type="gramStart"/>
-      <w:r>
-        <w:rPr>
-          <w:sz w:val="22"/>
-          <w:szCs w:val="22"/>
-        </w:rPr>
-        <w:t>O(</w:t>
-      </w:r>
-      <w:proofErr w:type="gramEnd"/>
-      <w:r>
-        <w:rPr>
-          <w:sz w:val="22"/>
-          <w:szCs w:val="22"/>
-        </w:rPr>
-        <w:t>1) Çözüm sadece tek bir toplama ve çarpma işlemi yapıyor; girdi boyutundan bağımsız sabit zamanda çalışıyor.</w:t>
+        <w:t>Zaman Karmaşıklığı: O(1) Çözüm sadece tek bir toplama ve çarpma işlemi yapıyor; girdi boyutundan bağımsız sabit zamanda çalışıyor.</w:t>
       </w:r>
     </w:p>
     <w:p>
@@ -977,65 +1236,1282 @@
           <w:sz w:val="22"/>
           <w:szCs w:val="22"/>
         </w:rPr>
-        <w:t xml:space="preserve">Alan Karmaşıklığı: </w:t>
-      </w:r>
-      <w:proofErr w:type="gramStart"/>
-      <w:r>
-        <w:rPr>
-          <w:sz w:val="22"/>
-          <w:szCs w:val="22"/>
-        </w:rPr>
-        <w:t>O(</w:t>
-      </w:r>
-      <w:proofErr w:type="gramEnd"/>
-      <w:r>
-        <w:rPr>
-          <w:sz w:val="22"/>
-          <w:szCs w:val="22"/>
-        </w:rPr>
-        <w:t>1) Girdi boyutuna bağlı büyüyen herhangi bir liste, dizi veya ekstra bellek yapısı kullanılmıyor.</w:t>
-      </w:r>
+        <w:t>Alan Karmaşıklığı: O(1) Girdi boyutuna bağlı büyüyen herhangi bir liste, dizi veya ekstra bellek yapısı kullanılmıyor.</w:t>
+      </w:r>
+    </w:p>
+    <w:p>
+      <w:pPr>
+        <w:spacing w:after="100"/>
+        <w:rPr>
+          <w:b/>
+          <w:bCs/>
+          <w:sz w:val="22"/>
+          <w:szCs w:val="22"/>
+        </w:rPr>
+      </w:pPr>
+    </w:p>
+    <w:p>
+      <w:pPr>
+        <w:spacing w:after="100"/>
+        <w:rPr>
+          <w:sz w:val="22"/>
+          <w:szCs w:val="22"/>
+        </w:rPr>
+      </w:pPr>
+      <w:r>
+        <w:rPr>
+          <w:b/>
+          <w:bCs/>
+          <w:sz w:val="22"/>
+          <w:szCs w:val="22"/>
+        </w:rPr>
+        <w:t xml:space="preserve">Problem 2: </w:t>
+      </w:r>
+      <w:proofErr w:type="spellStart"/>
+      <w:r>
+        <w:rPr>
+          <w:b/>
+          <w:bCs/>
+          <w:sz w:val="22"/>
+          <w:szCs w:val="22"/>
+        </w:rPr>
+        <w:t>Find</w:t>
+      </w:r>
+      <w:proofErr w:type="spellEnd"/>
+      <w:r>
+        <w:rPr>
+          <w:b/>
+          <w:bCs/>
+          <w:sz w:val="22"/>
+          <w:szCs w:val="22"/>
+        </w:rPr>
+        <w:t xml:space="preserve"> </w:t>
+      </w:r>
+      <w:proofErr w:type="spellStart"/>
+      <w:r>
+        <w:rPr>
+          <w:b/>
+          <w:bCs/>
+          <w:sz w:val="22"/>
+          <w:szCs w:val="22"/>
+        </w:rPr>
+        <w:t>Common</w:t>
+      </w:r>
+      <w:proofErr w:type="spellEnd"/>
+      <w:r>
+        <w:rPr>
+          <w:b/>
+          <w:bCs/>
+          <w:sz w:val="22"/>
+          <w:szCs w:val="22"/>
+        </w:rPr>
+        <w:t xml:space="preserve"> </w:t>
+      </w:r>
+      <w:proofErr w:type="spellStart"/>
+      <w:r>
+        <w:rPr>
+          <w:b/>
+          <w:bCs/>
+          <w:sz w:val="22"/>
+          <w:szCs w:val="22"/>
+        </w:rPr>
+        <w:t>Elements</w:t>
+      </w:r>
+      <w:proofErr w:type="spellEnd"/>
+      <w:r>
+        <w:rPr>
+          <w:b/>
+          <w:bCs/>
+          <w:sz w:val="22"/>
+          <w:szCs w:val="22"/>
+        </w:rPr>
+        <w:t xml:space="preserve"> </w:t>
+      </w:r>
+      <w:proofErr w:type="spellStart"/>
+      <w:r>
+        <w:rPr>
+          <w:b/>
+          <w:bCs/>
+          <w:sz w:val="22"/>
+          <w:szCs w:val="22"/>
+        </w:rPr>
+        <w:t>Between</w:t>
+      </w:r>
+      <w:proofErr w:type="spellEnd"/>
+      <w:r>
+        <w:rPr>
+          <w:b/>
+          <w:bCs/>
+          <w:sz w:val="22"/>
+          <w:szCs w:val="22"/>
+        </w:rPr>
+        <w:t xml:space="preserve"> Two </w:t>
+      </w:r>
+      <w:proofErr w:type="spellStart"/>
+      <w:r>
+        <w:rPr>
+          <w:b/>
+          <w:bCs/>
+          <w:sz w:val="22"/>
+          <w:szCs w:val="22"/>
+        </w:rPr>
+        <w:t>Arrays</w:t>
+      </w:r>
+      <w:proofErr w:type="spellEnd"/>
+      <w:r>
+        <w:rPr>
+          <w:sz w:val="22"/>
+          <w:szCs w:val="22"/>
+        </w:rPr>
+        <w:br/>
+      </w:r>
+      <w:hyperlink r:id="rId5" w:history="1">
+        <w:r>
+          <w:rPr>
+            <w:rStyle w:val="Kpr"/>
+            <w:sz w:val="22"/>
+            <w:szCs w:val="22"/>
+          </w:rPr>
+          <w:t>https://leetcode.com/problems/find-common-elements-between-two-arrays/</w:t>
+        </w:r>
+      </w:hyperlink>
+    </w:p>
+    <w:p>
+      <w:pPr>
+        <w:spacing w:after="100"/>
+        <w:rPr>
+          <w:sz w:val="22"/>
+          <w:szCs w:val="22"/>
+        </w:rPr>
+      </w:pPr>
+      <w:r>
+        <w:rPr>
+          <w:sz w:val="22"/>
+          <w:szCs w:val="22"/>
+        </w:rPr>
+        <w:t>Problem, iki dizi (nums1, nums2) veriliyorken, birinci dizideki kaç elemanın ikinci dizide de bulunduğunu (answer1) ve ikinci dizideki kaç elemanın birinci dizide de bulunduğunu (answer2) bulmayı istiyor. Çözümde her iki dizi de tek tek dolaşılıyor ve her eleman için diğer dizide olup olmadığı in operatörüyle kontrol ediliyor.</w:t>
+      </w:r>
+    </w:p>
+    <w:p>
+      <w:pPr>
+        <w:spacing w:after="100"/>
+        <w:rPr>
+          <w:sz w:val="22"/>
+          <w:szCs w:val="22"/>
+        </w:rPr>
+      </w:pPr>
+      <w:r>
+        <w:rPr>
+          <w:b/>
+          <w:bCs/>
+          <w:sz w:val="22"/>
+          <w:szCs w:val="22"/>
+        </w:rPr>
+        <w:t>Zaman Karmaşıklığı: O(</w:t>
+      </w:r>
+      <w:proofErr w:type="spellStart"/>
+      <w:r>
+        <w:rPr>
+          <w:b/>
+          <w:bCs/>
+          <w:sz w:val="22"/>
+          <w:szCs w:val="22"/>
+        </w:rPr>
+        <w:t>n×m</w:t>
+      </w:r>
+      <w:proofErr w:type="spellEnd"/>
+      <w:r>
+        <w:rPr>
+          <w:b/>
+          <w:bCs/>
+          <w:sz w:val="22"/>
+          <w:szCs w:val="22"/>
+        </w:rPr>
+        <w:t>)</w:t>
+      </w:r>
+      <w:r>
+        <w:rPr>
+          <w:sz w:val="22"/>
+          <w:szCs w:val="22"/>
+        </w:rPr>
+        <w:t xml:space="preserve"> — </w:t>
+      </w:r>
+      <w:proofErr w:type="spellStart"/>
+      <w:r>
+        <w:rPr>
+          <w:sz w:val="22"/>
+          <w:szCs w:val="22"/>
+        </w:rPr>
+        <w:t>num</w:t>
+      </w:r>
+      <w:proofErr w:type="spellEnd"/>
+      <w:r>
+        <w:rPr>
+          <w:sz w:val="22"/>
+          <w:szCs w:val="22"/>
+        </w:rPr>
+        <w:t xml:space="preserve"> in nums2 ve </w:t>
+      </w:r>
+      <w:proofErr w:type="spellStart"/>
+      <w:r>
+        <w:rPr>
+          <w:sz w:val="22"/>
+          <w:szCs w:val="22"/>
+        </w:rPr>
+        <w:t>num</w:t>
+      </w:r>
+      <w:proofErr w:type="spellEnd"/>
+      <w:r>
+        <w:rPr>
+          <w:sz w:val="22"/>
+          <w:szCs w:val="22"/>
+        </w:rPr>
+        <w:t xml:space="preserve"> in nums1 kontrolleri bir liste üzerinde doğrusal arama yaptığı için (Python'da listede in araması O(uzunluk) sürer), dıştaki döngüyle birleştiğinde toplam karmaşıklık dizilerin boyutlarının çarpımına yaklaşıyor. Diziler büyüdükçe bu çözüm yavaşlar.</w:t>
+      </w:r>
+    </w:p>
+    <w:p>
+      <w:pPr>
+        <w:spacing w:after="100"/>
+        <w:rPr>
+          <w:sz w:val="22"/>
+          <w:szCs w:val="22"/>
+        </w:rPr>
+      </w:pPr>
+      <w:r>
+        <w:rPr>
+          <w:b/>
+          <w:bCs/>
+          <w:sz w:val="22"/>
+          <w:szCs w:val="22"/>
+        </w:rPr>
+        <w:t>Alan Karmaşıklığı: O(1)</w:t>
+      </w:r>
+      <w:r>
+        <w:rPr>
+          <w:sz w:val="22"/>
+          <w:szCs w:val="22"/>
+        </w:rPr>
+        <w:t xml:space="preserve"> — Girdi boyutundan bağımsız olarak sadece iki sayaç değişkeni ve sabit boyutlu bir sonuç listesi tutuluyor.</w:t>
+      </w:r>
+    </w:p>
+    <w:p>
+      <w:pPr>
+        <w:spacing w:after="100"/>
+        <w:rPr>
+          <w:sz w:val="22"/>
+          <w:szCs w:val="22"/>
+        </w:rPr>
+      </w:pPr>
     </w:p>
     <w:p>
       <w:pPr>
         <w:pStyle w:val="Balk1"/>
         <w:spacing w:before="300" w:after="150"/>
         <w:rPr>
-          <w:sz w:val="22"/>
-          <w:szCs w:val="22"/>
-        </w:rPr>
-      </w:pPr>
-      <w:r>
-        <w:rPr>
-          <w:sz w:val="22"/>
-          <w:szCs w:val="22"/>
+          <w:b/>
+          <w:bCs/>
+          <w:color w:val="000000" w:themeColor="text1"/>
+          <w:sz w:val="28"/>
+          <w:szCs w:val="28"/>
+        </w:rPr>
+      </w:pPr>
+      <w:r>
+        <w:rPr>
+          <w:b/>
+          <w:bCs/>
+          <w:color w:val="000000" w:themeColor="text1"/>
+          <w:sz w:val="28"/>
+          <w:szCs w:val="28"/>
         </w:rPr>
         <w:t>3. Teknik Kaynak Özeti</w:t>
       </w:r>
-    </w:p>
-    <w:p>
-      <w:pPr>
-        <w:spacing w:after="100"/>
-        <w:rPr>
-          <w:sz w:val="22"/>
-          <w:szCs w:val="22"/>
-        </w:rPr>
-      </w:pPr>
     </w:p>
     <w:p>
       <w:pPr>
         <w:pStyle w:val="Balk1"/>
         <w:spacing w:before="300" w:after="150"/>
         <w:rPr>
-          <w:sz w:val="22"/>
-          <w:szCs w:val="22"/>
-        </w:rPr>
-      </w:pPr>
-      <w:r>
-        <w:rPr>
-          <w:sz w:val="22"/>
-          <w:szCs w:val="22"/>
-        </w:rPr>
+          <w:b/>
+          <w:bCs/>
+          <w:color w:val="000000" w:themeColor="text1"/>
+          <w:sz w:val="22"/>
+          <w:szCs w:val="22"/>
+        </w:rPr>
+      </w:pPr>
+      <w:r>
+        <w:rPr>
+          <w:b/>
+          <w:bCs/>
+          <w:color w:val="000000" w:themeColor="text1"/>
+          <w:sz w:val="22"/>
+          <w:szCs w:val="22"/>
+        </w:rPr>
+        <w:t xml:space="preserve">"How </w:t>
+      </w:r>
+      <w:proofErr w:type="spellStart"/>
+      <w:r>
+        <w:rPr>
+          <w:b/>
+          <w:bCs/>
+          <w:color w:val="000000" w:themeColor="text1"/>
+          <w:sz w:val="22"/>
+          <w:szCs w:val="22"/>
+        </w:rPr>
+        <w:t>to</w:t>
+      </w:r>
+      <w:proofErr w:type="spellEnd"/>
+      <w:r>
+        <w:rPr>
+          <w:b/>
+          <w:bCs/>
+          <w:color w:val="000000" w:themeColor="text1"/>
+          <w:sz w:val="22"/>
+          <w:szCs w:val="22"/>
+        </w:rPr>
+        <w:t xml:space="preserve"> </w:t>
+      </w:r>
+      <w:proofErr w:type="spellStart"/>
+      <w:r>
+        <w:rPr>
+          <w:b/>
+          <w:bCs/>
+          <w:color w:val="000000" w:themeColor="text1"/>
+          <w:sz w:val="22"/>
+          <w:szCs w:val="22"/>
+        </w:rPr>
+        <w:t>Use</w:t>
+      </w:r>
+      <w:proofErr w:type="spellEnd"/>
+      <w:r>
+        <w:rPr>
+          <w:b/>
+          <w:bCs/>
+          <w:color w:val="000000" w:themeColor="text1"/>
+          <w:sz w:val="22"/>
+          <w:szCs w:val="22"/>
+        </w:rPr>
+        <w:t xml:space="preserve"> </w:t>
+      </w:r>
+      <w:proofErr w:type="spellStart"/>
+      <w:r>
+        <w:rPr>
+          <w:b/>
+          <w:bCs/>
+          <w:color w:val="000000" w:themeColor="text1"/>
+          <w:sz w:val="22"/>
+          <w:szCs w:val="22"/>
+        </w:rPr>
+        <w:t>List</w:t>
+      </w:r>
+      <w:proofErr w:type="spellEnd"/>
+      <w:r>
+        <w:rPr>
+          <w:b/>
+          <w:bCs/>
+          <w:color w:val="000000" w:themeColor="text1"/>
+          <w:sz w:val="22"/>
+          <w:szCs w:val="22"/>
+        </w:rPr>
+        <w:t xml:space="preserve"> </w:t>
+      </w:r>
+      <w:proofErr w:type="spellStart"/>
+      <w:r>
+        <w:rPr>
+          <w:b/>
+          <w:bCs/>
+          <w:color w:val="000000" w:themeColor="text1"/>
+          <w:sz w:val="22"/>
+          <w:szCs w:val="22"/>
+        </w:rPr>
+        <w:t>Comprehensions</w:t>
+      </w:r>
+      <w:proofErr w:type="spellEnd"/>
+      <w:r>
+        <w:rPr>
+          <w:b/>
+          <w:bCs/>
+          <w:color w:val="000000" w:themeColor="text1"/>
+          <w:sz w:val="22"/>
+          <w:szCs w:val="22"/>
+        </w:rPr>
+        <w:t xml:space="preserve"> in Python"</w:t>
+      </w:r>
+    </w:p>
+    <w:p>
+      <w:pPr>
+        <w:pStyle w:val="Balk1"/>
+        <w:spacing w:before="300" w:after="150"/>
+        <w:rPr>
+          <w:color w:val="000000" w:themeColor="text1"/>
+          <w:sz w:val="22"/>
+          <w:szCs w:val="22"/>
+        </w:rPr>
+      </w:pPr>
+      <w:proofErr w:type="spellStart"/>
+      <w:r>
+        <w:rPr>
+          <w:color w:val="000000" w:themeColor="text1"/>
+          <w:sz w:val="22"/>
+          <w:szCs w:val="22"/>
+        </w:rPr>
+        <w:t>List</w:t>
+      </w:r>
+      <w:proofErr w:type="spellEnd"/>
+      <w:r>
+        <w:rPr>
+          <w:color w:val="000000" w:themeColor="text1"/>
+          <w:sz w:val="22"/>
+          <w:szCs w:val="22"/>
+        </w:rPr>
+        <w:t xml:space="preserve"> </w:t>
+      </w:r>
+      <w:proofErr w:type="spellStart"/>
+      <w:r>
+        <w:rPr>
+          <w:color w:val="000000" w:themeColor="text1"/>
+          <w:sz w:val="22"/>
+          <w:szCs w:val="22"/>
+        </w:rPr>
+        <w:t>comprehension</w:t>
+      </w:r>
+      <w:proofErr w:type="spellEnd"/>
+      <w:r>
+        <w:rPr>
+          <w:color w:val="000000" w:themeColor="text1"/>
+          <w:sz w:val="22"/>
+          <w:szCs w:val="22"/>
+        </w:rPr>
+        <w:t xml:space="preserve">, mevcut bir </w:t>
+      </w:r>
+      <w:proofErr w:type="spellStart"/>
+      <w:r>
+        <w:rPr>
+          <w:color w:val="000000" w:themeColor="text1"/>
+          <w:sz w:val="22"/>
+          <w:szCs w:val="22"/>
+        </w:rPr>
+        <w:t>iterable'dan</w:t>
+      </w:r>
+      <w:proofErr w:type="spellEnd"/>
+      <w:r>
+        <w:rPr>
+          <w:color w:val="000000" w:themeColor="text1"/>
+          <w:sz w:val="22"/>
+          <w:szCs w:val="22"/>
+        </w:rPr>
+        <w:t xml:space="preserve"> (dizi/liste gibi) yeni bir liste oluşturmanın kısa ve tek satırlık bir yolunu sunar</w:t>
+      </w:r>
+      <w:r>
+        <w:rPr>
+          <w:color w:val="000000" w:themeColor="text1"/>
+          <w:sz w:val="22"/>
+          <w:szCs w:val="22"/>
+        </w:rPr>
+        <w:t>. B</w:t>
+      </w:r>
+      <w:r>
+        <w:rPr>
+          <w:color w:val="000000" w:themeColor="text1"/>
+          <w:sz w:val="22"/>
+          <w:szCs w:val="22"/>
+        </w:rPr>
+        <w:t>u da .</w:t>
+      </w:r>
+      <w:proofErr w:type="spellStart"/>
+      <w:r>
+        <w:rPr>
+          <w:color w:val="000000" w:themeColor="text1"/>
+          <w:sz w:val="22"/>
+          <w:szCs w:val="22"/>
+        </w:rPr>
+        <w:t>append</w:t>
+      </w:r>
+      <w:proofErr w:type="spellEnd"/>
+      <w:r>
+        <w:rPr>
+          <w:color w:val="000000" w:themeColor="text1"/>
+          <w:sz w:val="22"/>
+          <w:szCs w:val="22"/>
+        </w:rPr>
+        <w:t xml:space="preserve">() </w:t>
+      </w:r>
+      <w:r>
+        <w:rPr>
+          <w:color w:val="000000" w:themeColor="text1"/>
+          <w:sz w:val="22"/>
+          <w:szCs w:val="22"/>
+        </w:rPr>
+        <w:t xml:space="preserve">fonksiyonu </w:t>
+      </w:r>
+      <w:r>
+        <w:rPr>
+          <w:color w:val="000000" w:themeColor="text1"/>
+          <w:sz w:val="22"/>
+          <w:szCs w:val="22"/>
+        </w:rPr>
+        <w:t xml:space="preserve">ile tekrar tekrar eleman ekleyen daha uzun </w:t>
+      </w:r>
+      <w:proofErr w:type="spellStart"/>
+      <w:r>
+        <w:rPr>
+          <w:color w:val="000000" w:themeColor="text1"/>
+          <w:sz w:val="22"/>
+          <w:szCs w:val="22"/>
+        </w:rPr>
+        <w:t>for</w:t>
+      </w:r>
+      <w:proofErr w:type="spellEnd"/>
+      <w:r>
+        <w:rPr>
+          <w:color w:val="000000" w:themeColor="text1"/>
+          <w:sz w:val="22"/>
+          <w:szCs w:val="22"/>
+        </w:rPr>
+        <w:t xml:space="preserve"> döngüsü yazma ihtiyacını ortadan kaldırır. Temel söz dizimi ifade </w:t>
+      </w:r>
+      <w:r>
+        <w:rPr>
+          <w:color w:val="000000" w:themeColor="text1"/>
+          <w:sz w:val="22"/>
+          <w:szCs w:val="22"/>
+        </w:rPr>
+        <w:t>(</w:t>
+      </w:r>
+      <w:proofErr w:type="spellStart"/>
+      <w:r>
+        <w:rPr>
+          <w:color w:val="000000" w:themeColor="text1"/>
+          <w:sz w:val="22"/>
+          <w:szCs w:val="22"/>
+        </w:rPr>
+        <w:t>for</w:t>
+      </w:r>
+      <w:proofErr w:type="spellEnd"/>
+      <w:r>
+        <w:rPr>
+          <w:color w:val="000000" w:themeColor="text1"/>
+          <w:sz w:val="22"/>
+          <w:szCs w:val="22"/>
+        </w:rPr>
+        <w:t xml:space="preserve"> eleman in </w:t>
+      </w:r>
+      <w:proofErr w:type="spellStart"/>
+      <w:r>
+        <w:rPr>
+          <w:color w:val="000000" w:themeColor="text1"/>
+          <w:sz w:val="22"/>
+          <w:szCs w:val="22"/>
+        </w:rPr>
+        <w:t>iterable</w:t>
+      </w:r>
+      <w:proofErr w:type="spellEnd"/>
+      <w:r>
+        <w:rPr>
+          <w:color w:val="000000" w:themeColor="text1"/>
+          <w:sz w:val="22"/>
+          <w:szCs w:val="22"/>
+        </w:rPr>
+        <w:t>)</w:t>
+      </w:r>
+      <w:r>
+        <w:rPr>
+          <w:color w:val="000000" w:themeColor="text1"/>
+          <w:sz w:val="22"/>
+          <w:szCs w:val="22"/>
+        </w:rPr>
+        <w:t xml:space="preserve"> şeklindedir</w:t>
+      </w:r>
+      <w:r>
+        <w:rPr>
+          <w:color w:val="000000" w:themeColor="text1"/>
+          <w:sz w:val="22"/>
+          <w:szCs w:val="22"/>
+        </w:rPr>
+        <w:t xml:space="preserve"> .Y</w:t>
+      </w:r>
+      <w:r>
+        <w:rPr>
+          <w:color w:val="000000" w:themeColor="text1"/>
+          <w:sz w:val="22"/>
+          <w:szCs w:val="22"/>
+        </w:rPr>
+        <w:t>ani her elemana ne yapılacağını yazıp, sonucu direkt yeni bir listeye topluyorsun.</w:t>
+      </w:r>
+    </w:p>
+    <w:p>
+      <w:pPr>
+        <w:pStyle w:val="Balk1"/>
+        <w:spacing w:before="300" w:after="150"/>
+        <w:rPr>
+          <w:color w:val="000000" w:themeColor="text1"/>
+          <w:sz w:val="22"/>
+          <w:szCs w:val="22"/>
+        </w:rPr>
+      </w:pPr>
+      <w:r>
+        <w:rPr>
+          <w:color w:val="000000" w:themeColor="text1"/>
+          <w:sz w:val="22"/>
+          <w:szCs w:val="22"/>
+        </w:rPr>
+        <w:t xml:space="preserve">Basit dönüşümlerin ötesinde, </w:t>
+      </w:r>
+      <w:proofErr w:type="spellStart"/>
+      <w:r>
+        <w:rPr>
+          <w:color w:val="000000" w:themeColor="text1"/>
+          <w:sz w:val="22"/>
+          <w:szCs w:val="22"/>
+        </w:rPr>
+        <w:t>list</w:t>
+      </w:r>
+      <w:proofErr w:type="spellEnd"/>
+      <w:r>
+        <w:rPr>
+          <w:color w:val="000000" w:themeColor="text1"/>
+          <w:sz w:val="22"/>
+          <w:szCs w:val="22"/>
+        </w:rPr>
+        <w:t xml:space="preserve"> </w:t>
+      </w:r>
+      <w:proofErr w:type="spellStart"/>
+      <w:r>
+        <w:rPr>
+          <w:color w:val="000000" w:themeColor="text1"/>
+          <w:sz w:val="22"/>
+          <w:szCs w:val="22"/>
+        </w:rPr>
+        <w:t>comprehension</w:t>
+      </w:r>
+      <w:proofErr w:type="spellEnd"/>
+      <w:r>
+        <w:rPr>
+          <w:color w:val="000000" w:themeColor="text1"/>
+          <w:sz w:val="22"/>
+          <w:szCs w:val="22"/>
+        </w:rPr>
+        <w:t xml:space="preserve"> isteğe bağlı bir </w:t>
+      </w:r>
+      <w:proofErr w:type="spellStart"/>
+      <w:r>
+        <w:rPr>
+          <w:color w:val="000000" w:themeColor="text1"/>
+          <w:sz w:val="22"/>
+          <w:szCs w:val="22"/>
+        </w:rPr>
+        <w:t>if</w:t>
+      </w:r>
+      <w:proofErr w:type="spellEnd"/>
+      <w:r>
+        <w:rPr>
+          <w:color w:val="000000" w:themeColor="text1"/>
+          <w:sz w:val="22"/>
+          <w:szCs w:val="22"/>
+        </w:rPr>
+        <w:t xml:space="preserve"> koşuluyla filtreleme de yapabilir (sadece belirli bir koşulu sağlayan elemanları listeye dahil eder) ve iç içe kullanılarak liste</w:t>
+      </w:r>
+      <w:r>
+        <w:rPr>
+          <w:color w:val="000000" w:themeColor="text1"/>
+          <w:sz w:val="22"/>
+          <w:szCs w:val="22"/>
+        </w:rPr>
+        <w:t xml:space="preserve"> </w:t>
+      </w:r>
+      <w:r>
+        <w:rPr>
+          <w:color w:val="000000" w:themeColor="text1"/>
+          <w:sz w:val="22"/>
+          <w:szCs w:val="22"/>
+        </w:rPr>
+        <w:t>içinde</w:t>
+      </w:r>
+      <w:r>
+        <w:rPr>
+          <w:color w:val="000000" w:themeColor="text1"/>
+          <w:sz w:val="22"/>
+          <w:szCs w:val="22"/>
+        </w:rPr>
+        <w:t xml:space="preserve"> </w:t>
+      </w:r>
+      <w:r>
+        <w:rPr>
+          <w:color w:val="000000" w:themeColor="text1"/>
+          <w:sz w:val="22"/>
+          <w:szCs w:val="22"/>
+        </w:rPr>
+        <w:t xml:space="preserve">liste gibi çok boyutlu verileri düzleştirmek ya da işlemek için de kullanılabilir. Aynı ifade tarzı, doğal olarak </w:t>
+      </w:r>
+      <w:proofErr w:type="spellStart"/>
+      <w:r>
+        <w:rPr>
+          <w:color w:val="000000" w:themeColor="text1"/>
+          <w:sz w:val="22"/>
+          <w:szCs w:val="22"/>
+        </w:rPr>
+        <w:t>dictionary</w:t>
+      </w:r>
+      <w:proofErr w:type="spellEnd"/>
+      <w:r>
+        <w:rPr>
+          <w:color w:val="000000" w:themeColor="text1"/>
+          <w:sz w:val="22"/>
+          <w:szCs w:val="22"/>
+        </w:rPr>
+        <w:t xml:space="preserve"> ve set </w:t>
+      </w:r>
+      <w:proofErr w:type="spellStart"/>
+      <w:r>
+        <w:rPr>
+          <w:color w:val="000000" w:themeColor="text1"/>
+          <w:sz w:val="22"/>
+          <w:szCs w:val="22"/>
+        </w:rPr>
+        <w:t>comprehension'lara</w:t>
+      </w:r>
+      <w:proofErr w:type="spellEnd"/>
+      <w:r>
+        <w:rPr>
+          <w:color w:val="000000" w:themeColor="text1"/>
+          <w:sz w:val="22"/>
+          <w:szCs w:val="22"/>
+        </w:rPr>
+        <w:t xml:space="preserve"> da genişletilebilir.</w:t>
+      </w:r>
+    </w:p>
+    <w:p>
+      <w:pPr>
+        <w:pStyle w:val="Balk1"/>
+        <w:spacing w:before="300" w:after="150"/>
+        <w:rPr>
+          <w:color w:val="000000" w:themeColor="text1"/>
+          <w:sz w:val="22"/>
+          <w:szCs w:val="22"/>
+        </w:rPr>
+      </w:pPr>
+      <w:r>
+        <w:rPr>
+          <w:color w:val="000000" w:themeColor="text1"/>
+          <w:sz w:val="22"/>
+          <w:szCs w:val="22"/>
+        </w:rPr>
+        <w:t>Makalenin vurguladığı ana denge şu</w:t>
+      </w:r>
+      <w:r>
+        <w:rPr>
+          <w:color w:val="000000" w:themeColor="text1"/>
+          <w:sz w:val="22"/>
+          <w:szCs w:val="22"/>
+        </w:rPr>
+        <w:t xml:space="preserve"> </w:t>
+      </w:r>
+      <w:r>
+        <w:rPr>
+          <w:color w:val="000000" w:themeColor="text1"/>
+          <w:sz w:val="22"/>
+          <w:szCs w:val="22"/>
+        </w:rPr>
+        <w:t xml:space="preserve"> </w:t>
+      </w:r>
+      <w:proofErr w:type="spellStart"/>
+      <w:r>
+        <w:rPr>
+          <w:color w:val="000000" w:themeColor="text1"/>
+          <w:sz w:val="22"/>
+          <w:szCs w:val="22"/>
+        </w:rPr>
+        <w:t>list</w:t>
+      </w:r>
+      <w:proofErr w:type="spellEnd"/>
+      <w:r>
+        <w:rPr>
+          <w:color w:val="000000" w:themeColor="text1"/>
+          <w:sz w:val="22"/>
+          <w:szCs w:val="22"/>
+        </w:rPr>
+        <w:t xml:space="preserve"> </w:t>
+      </w:r>
+      <w:proofErr w:type="spellStart"/>
+      <w:r>
+        <w:rPr>
+          <w:color w:val="000000" w:themeColor="text1"/>
+          <w:sz w:val="22"/>
+          <w:szCs w:val="22"/>
+        </w:rPr>
+        <w:t>comprehension</w:t>
+      </w:r>
+      <w:proofErr w:type="spellEnd"/>
+      <w:r>
+        <w:rPr>
+          <w:color w:val="000000" w:themeColor="text1"/>
+          <w:sz w:val="22"/>
+          <w:szCs w:val="22"/>
+        </w:rPr>
+        <w:t xml:space="preserve">, basit döngü </w:t>
+      </w:r>
+      <w:r>
+        <w:rPr>
+          <w:color w:val="000000" w:themeColor="text1"/>
+          <w:sz w:val="22"/>
+          <w:szCs w:val="22"/>
+        </w:rPr>
+        <w:t>ve</w:t>
+      </w:r>
+      <w:r>
+        <w:rPr>
+          <w:color w:val="000000" w:themeColor="text1"/>
+          <w:sz w:val="22"/>
+          <w:szCs w:val="22"/>
+        </w:rPr>
+        <w:t xml:space="preserve"> filtreleme mantığı için kodu daha kısa ve genelde daha okunaklı hale getirir</w:t>
+      </w:r>
+      <w:r>
+        <w:rPr>
+          <w:color w:val="000000" w:themeColor="text1"/>
+          <w:sz w:val="22"/>
+          <w:szCs w:val="22"/>
+        </w:rPr>
+        <w:t>. A</w:t>
+      </w:r>
+      <w:r>
+        <w:rPr>
+          <w:color w:val="000000" w:themeColor="text1"/>
+          <w:sz w:val="22"/>
+          <w:szCs w:val="22"/>
+        </w:rPr>
+        <w:t>ma mantık çok karmaşıklaşır ya da derinlemesine iç içe geçerse, geleneksel bir döngü genellikle daha anlaşılır ve bakımı daha kolay olur. Yan</w:t>
+      </w:r>
+      <w:r>
+        <w:rPr>
+          <w:color w:val="000000" w:themeColor="text1"/>
+          <w:sz w:val="22"/>
+          <w:szCs w:val="22"/>
+        </w:rPr>
+        <w:t>i</w:t>
+      </w:r>
+      <w:r>
+        <w:rPr>
+          <w:color w:val="000000" w:themeColor="text1"/>
+          <w:sz w:val="22"/>
+          <w:szCs w:val="22"/>
+        </w:rPr>
+        <w:t xml:space="preserve"> dönüşüm basitse </w:t>
+      </w:r>
+      <w:proofErr w:type="spellStart"/>
+      <w:r>
+        <w:rPr>
+          <w:color w:val="000000" w:themeColor="text1"/>
+          <w:sz w:val="22"/>
+          <w:szCs w:val="22"/>
+        </w:rPr>
+        <w:t>comprehension</w:t>
+      </w:r>
+      <w:proofErr w:type="spellEnd"/>
+      <w:r>
+        <w:rPr>
+          <w:color w:val="000000" w:themeColor="text1"/>
+          <w:sz w:val="22"/>
+          <w:szCs w:val="22"/>
+        </w:rPr>
+        <w:t xml:space="preserve"> kullan, mantık karmaşıklaşırsa normal döngüye geri dön.</w:t>
+      </w:r>
+    </w:p>
+    <w:p>
+      <w:pPr>
+        <w:pStyle w:val="Balk1"/>
+        <w:spacing w:before="300" w:after="150"/>
+        <w:rPr>
+          <w:color w:val="000000" w:themeColor="text1"/>
+          <w:sz w:val="22"/>
+          <w:szCs w:val="22"/>
+        </w:rPr>
+      </w:pPr>
+      <w:r>
+        <w:rPr>
+          <w:color w:val="000000" w:themeColor="text1"/>
+          <w:sz w:val="22"/>
+          <w:szCs w:val="22"/>
+        </w:rPr>
+        <w:t>Kısacası ,</w:t>
+      </w:r>
+      <w:r>
+        <w:rPr>
+          <w:color w:val="auto"/>
+          <w:sz w:val="20"/>
+          <w:szCs w:val="20"/>
+        </w:rPr>
+        <w:t xml:space="preserve"> </w:t>
+      </w:r>
+      <w:proofErr w:type="spellStart"/>
+      <w:r>
+        <w:rPr>
+          <w:color w:val="000000" w:themeColor="text1"/>
+          <w:sz w:val="22"/>
+          <w:szCs w:val="22"/>
+        </w:rPr>
+        <w:t>List</w:t>
+      </w:r>
+      <w:proofErr w:type="spellEnd"/>
+      <w:r>
+        <w:rPr>
+          <w:color w:val="000000" w:themeColor="text1"/>
+          <w:sz w:val="22"/>
+          <w:szCs w:val="22"/>
+        </w:rPr>
+        <w:t xml:space="preserve"> </w:t>
+      </w:r>
+      <w:proofErr w:type="spellStart"/>
+      <w:r>
+        <w:rPr>
+          <w:color w:val="000000" w:themeColor="text1"/>
+          <w:sz w:val="22"/>
+          <w:szCs w:val="22"/>
+        </w:rPr>
+        <w:t>comprehension</w:t>
+      </w:r>
+      <w:proofErr w:type="spellEnd"/>
+      <w:r>
+        <w:rPr>
+          <w:color w:val="000000" w:themeColor="text1"/>
+          <w:sz w:val="22"/>
+          <w:szCs w:val="22"/>
+        </w:rPr>
+        <w:t xml:space="preserve">, bir </w:t>
+      </w:r>
+      <w:proofErr w:type="spellStart"/>
+      <w:r>
+        <w:rPr>
+          <w:color w:val="000000" w:themeColor="text1"/>
+          <w:sz w:val="22"/>
+          <w:szCs w:val="22"/>
+        </w:rPr>
+        <w:t>for</w:t>
+      </w:r>
+      <w:proofErr w:type="spellEnd"/>
+      <w:r>
+        <w:rPr>
+          <w:color w:val="000000" w:themeColor="text1"/>
+          <w:sz w:val="22"/>
+          <w:szCs w:val="22"/>
+        </w:rPr>
+        <w:t xml:space="preserve"> döngüsüyle listeye eleman eklemek yerine, aynı işi tek satırda yapmanı sağlar</w:t>
+      </w:r>
+      <w:r>
+        <w:rPr>
+          <w:color w:val="000000" w:themeColor="text1"/>
+          <w:sz w:val="22"/>
+          <w:szCs w:val="22"/>
+        </w:rPr>
+        <w:t>.</w:t>
+      </w:r>
+    </w:p>
+    <w:p>
+      <w:pPr>
+        <w:pStyle w:val="Balk1"/>
+        <w:spacing w:before="300" w:after="150"/>
+        <w:rPr>
+          <w:b/>
+          <w:bCs/>
+          <w:color w:val="000000" w:themeColor="text1"/>
+          <w:sz w:val="22"/>
+          <w:szCs w:val="22"/>
+        </w:rPr>
+      </w:pPr>
+      <w:r>
+        <w:rPr>
+          <w:b/>
+          <w:bCs/>
+          <w:color w:val="000000" w:themeColor="text1"/>
+          <w:sz w:val="22"/>
+          <w:szCs w:val="22"/>
+        </w:rPr>
+        <w:t>Normal döngüyle (uzun yol):</w:t>
+      </w:r>
+    </w:p>
+    <w:p>
+      <w:pPr>
+        <w:pStyle w:val="Balk1"/>
+        <w:spacing w:before="300" w:after="150"/>
+        <w:rPr>
+          <w:color w:val="000000" w:themeColor="text1"/>
+          <w:sz w:val="22"/>
+          <w:szCs w:val="22"/>
+        </w:rPr>
+      </w:pPr>
+      <w:r>
+        <w:rPr>
+          <w:color w:val="000000" w:themeColor="text1"/>
+          <w:sz w:val="22"/>
+          <w:szCs w:val="22"/>
+        </w:rPr>
+        <w:t xml:space="preserve">kareler = [] </w:t>
+      </w:r>
+    </w:p>
+    <w:p>
+      <w:pPr>
+        <w:pStyle w:val="Balk1"/>
+        <w:spacing w:before="300" w:after="150"/>
+        <w:rPr>
+          <w:color w:val="000000" w:themeColor="text1"/>
+          <w:sz w:val="22"/>
+          <w:szCs w:val="22"/>
+        </w:rPr>
+      </w:pPr>
+      <w:proofErr w:type="spellStart"/>
+      <w:r>
+        <w:rPr>
+          <w:color w:val="000000" w:themeColor="text1"/>
+          <w:sz w:val="22"/>
+          <w:szCs w:val="22"/>
+        </w:rPr>
+        <w:t>for</w:t>
+      </w:r>
+      <w:proofErr w:type="spellEnd"/>
+      <w:r>
+        <w:rPr>
+          <w:color w:val="000000" w:themeColor="text1"/>
+          <w:sz w:val="22"/>
+          <w:szCs w:val="22"/>
+        </w:rPr>
+        <w:t xml:space="preserve"> </w:t>
+      </w:r>
+      <w:proofErr w:type="spellStart"/>
+      <w:r>
+        <w:rPr>
+          <w:color w:val="000000" w:themeColor="text1"/>
+          <w:sz w:val="22"/>
+          <w:szCs w:val="22"/>
+        </w:rPr>
+        <w:t>sayi</w:t>
+      </w:r>
+      <w:proofErr w:type="spellEnd"/>
+      <w:r>
+        <w:rPr>
+          <w:color w:val="000000" w:themeColor="text1"/>
+          <w:sz w:val="22"/>
+          <w:szCs w:val="22"/>
+        </w:rPr>
+        <w:t xml:space="preserve"> in </w:t>
+      </w:r>
+      <w:proofErr w:type="spellStart"/>
+      <w:r>
+        <w:rPr>
+          <w:color w:val="000000" w:themeColor="text1"/>
+          <w:sz w:val="22"/>
+          <w:szCs w:val="22"/>
+        </w:rPr>
+        <w:t>range</w:t>
+      </w:r>
+      <w:proofErr w:type="spellEnd"/>
+      <w:r>
+        <w:rPr>
+          <w:color w:val="000000" w:themeColor="text1"/>
+          <w:sz w:val="22"/>
+          <w:szCs w:val="22"/>
+        </w:rPr>
+        <w:t xml:space="preserve">(5): </w:t>
+      </w:r>
+    </w:p>
+    <w:p>
+      <w:pPr>
+        <w:pStyle w:val="Balk1"/>
+        <w:spacing w:before="300" w:after="150"/>
+        <w:ind w:firstLine="708"/>
+        <w:rPr>
+          <w:color w:val="000000" w:themeColor="text1"/>
+          <w:sz w:val="22"/>
+          <w:szCs w:val="22"/>
+        </w:rPr>
+      </w:pPr>
+      <w:proofErr w:type="spellStart"/>
+      <w:r>
+        <w:rPr>
+          <w:color w:val="000000" w:themeColor="text1"/>
+          <w:sz w:val="22"/>
+          <w:szCs w:val="22"/>
+        </w:rPr>
+        <w:t>kareler.append</w:t>
+      </w:r>
+      <w:proofErr w:type="spellEnd"/>
+      <w:r>
+        <w:rPr>
+          <w:color w:val="000000" w:themeColor="text1"/>
+          <w:sz w:val="22"/>
+          <w:szCs w:val="22"/>
+        </w:rPr>
+        <w:t>(</w:t>
+      </w:r>
+      <w:proofErr w:type="spellStart"/>
+      <w:r>
+        <w:rPr>
+          <w:color w:val="000000" w:themeColor="text1"/>
+          <w:sz w:val="22"/>
+          <w:szCs w:val="22"/>
+        </w:rPr>
+        <w:t>sayi</w:t>
+      </w:r>
+      <w:proofErr w:type="spellEnd"/>
+      <w:r>
+        <w:rPr>
+          <w:color w:val="000000" w:themeColor="text1"/>
+          <w:sz w:val="22"/>
+          <w:szCs w:val="22"/>
+        </w:rPr>
+        <w:t xml:space="preserve"> ** 2)</w:t>
+      </w:r>
+    </w:p>
+    <w:p>
+      <w:pPr>
+        <w:spacing w:after="100"/>
+        <w:rPr>
+          <w:b/>
+          <w:bCs/>
+          <w:sz w:val="22"/>
+          <w:szCs w:val="22"/>
+        </w:rPr>
+      </w:pPr>
+      <w:proofErr w:type="spellStart"/>
+      <w:r>
+        <w:rPr>
+          <w:b/>
+          <w:bCs/>
+          <w:sz w:val="22"/>
+          <w:szCs w:val="22"/>
+        </w:rPr>
+        <w:t>List</w:t>
+      </w:r>
+      <w:proofErr w:type="spellEnd"/>
+      <w:r>
+        <w:rPr>
+          <w:b/>
+          <w:bCs/>
+          <w:sz w:val="22"/>
+          <w:szCs w:val="22"/>
+        </w:rPr>
+        <w:t xml:space="preserve"> </w:t>
+      </w:r>
+      <w:proofErr w:type="spellStart"/>
+      <w:r>
+        <w:rPr>
+          <w:b/>
+          <w:bCs/>
+          <w:sz w:val="22"/>
+          <w:szCs w:val="22"/>
+        </w:rPr>
+        <w:t>comprehension</w:t>
+      </w:r>
+      <w:proofErr w:type="spellEnd"/>
+      <w:r>
+        <w:rPr>
+          <w:b/>
+          <w:bCs/>
+          <w:sz w:val="22"/>
+          <w:szCs w:val="22"/>
+        </w:rPr>
+        <w:t xml:space="preserve"> ile (kısa yol):</w:t>
+      </w:r>
+    </w:p>
+    <w:p>
+      <w:pPr>
+        <w:spacing w:after="100"/>
+        <w:rPr>
+          <w:sz w:val="22"/>
+          <w:szCs w:val="22"/>
+        </w:rPr>
+      </w:pPr>
+      <w:r>
+        <w:rPr>
+          <w:sz w:val="22"/>
+          <w:szCs w:val="22"/>
+        </w:rPr>
+        <w:t>kareler = [</w:t>
+      </w:r>
+      <w:proofErr w:type="spellStart"/>
+      <w:r>
+        <w:rPr>
+          <w:sz w:val="22"/>
+          <w:szCs w:val="22"/>
+        </w:rPr>
+        <w:t>sayi</w:t>
+      </w:r>
+      <w:proofErr w:type="spellEnd"/>
+      <w:r>
+        <w:rPr>
+          <w:sz w:val="22"/>
+          <w:szCs w:val="22"/>
+        </w:rPr>
+        <w:t xml:space="preserve"> ** 2 </w:t>
+      </w:r>
+      <w:proofErr w:type="spellStart"/>
+      <w:r>
+        <w:rPr>
+          <w:sz w:val="22"/>
+          <w:szCs w:val="22"/>
+        </w:rPr>
+        <w:t>for</w:t>
+      </w:r>
+      <w:proofErr w:type="spellEnd"/>
+      <w:r>
+        <w:rPr>
+          <w:sz w:val="22"/>
+          <w:szCs w:val="22"/>
+        </w:rPr>
+        <w:t xml:space="preserve"> </w:t>
+      </w:r>
+      <w:proofErr w:type="spellStart"/>
+      <w:r>
+        <w:rPr>
+          <w:sz w:val="22"/>
+          <w:szCs w:val="22"/>
+        </w:rPr>
+        <w:t>sayi</w:t>
+      </w:r>
+      <w:proofErr w:type="spellEnd"/>
+      <w:r>
+        <w:rPr>
+          <w:sz w:val="22"/>
+          <w:szCs w:val="22"/>
+        </w:rPr>
+        <w:t xml:space="preserve"> in </w:t>
+      </w:r>
+      <w:proofErr w:type="spellStart"/>
+      <w:r>
+        <w:rPr>
+          <w:sz w:val="22"/>
+          <w:szCs w:val="22"/>
+        </w:rPr>
+        <w:t>range</w:t>
+      </w:r>
+      <w:proofErr w:type="spellEnd"/>
+      <w:r>
+        <w:rPr>
+          <w:sz w:val="22"/>
+          <w:szCs w:val="22"/>
+        </w:rPr>
+        <w:t>(5)]</w:t>
+      </w:r>
+    </w:p>
+    <w:p>
+      <w:pPr>
+        <w:pStyle w:val="Balk1"/>
+        <w:spacing w:before="300" w:after="150"/>
+        <w:rPr>
+          <w:b/>
+          <w:bCs/>
+          <w:color w:val="000000" w:themeColor="text1"/>
+          <w:sz w:val="28"/>
+          <w:szCs w:val="28"/>
+        </w:rPr>
+      </w:pPr>
+      <w:r>
+        <w:rPr>
+          <w:b/>
+          <w:bCs/>
+          <w:color w:val="000000" w:themeColor="text1"/>
+          <w:sz w:val="28"/>
+          <w:szCs w:val="28"/>
+        </w:rPr>
+        <w:lastRenderedPageBreak/>
         <w:t>4. Uyku Takip Tablosu</w:t>
       </w:r>
     </w:p>
@@ -1157,15 +2633,7 @@
                 <w:sz w:val="22"/>
                 <w:szCs w:val="22"/>
               </w:rPr>
-              <w:t>0</w:t>
-            </w:r>
-            <w:r>
-              <w:rPr>
-                <w:color w:val="000000" w:themeColor="text1"/>
-                <w:sz w:val="22"/>
-                <w:szCs w:val="22"/>
-              </w:rPr>
-              <w:t>.</w:t>
+              <w:t>0.</w:t>
             </w:r>
             <w:r>
               <w:rPr>
@@ -1196,15 +2664,7 @@
                 <w:sz w:val="22"/>
                 <w:szCs w:val="22"/>
               </w:rPr>
-              <w:t>09.</w:t>
-            </w:r>
-            <w:r>
-              <w:rPr>
-                <w:color w:val="000000" w:themeColor="text1"/>
-                <w:sz w:val="22"/>
-                <w:szCs w:val="22"/>
-              </w:rPr>
-              <w:t>00</w:t>
+              <w:t>09.00</w:t>
             </w:r>
           </w:p>
         </w:tc>
@@ -1318,15 +2778,7 @@
                 <w:sz w:val="22"/>
                 <w:szCs w:val="22"/>
               </w:rPr>
-              <w:t>3</w:t>
-            </w:r>
-            <w:r>
-              <w:rPr>
-                <w:color w:val="000000" w:themeColor="text1"/>
-                <w:sz w:val="22"/>
-                <w:szCs w:val="22"/>
-              </w:rPr>
-              <w:t>0</w:t>
+              <w:t>30</w:t>
             </w:r>
           </w:p>
         </w:tc>
@@ -1349,23 +2801,7 @@
                 <w:sz w:val="22"/>
                 <w:szCs w:val="22"/>
               </w:rPr>
-              <w:t>08</w:t>
-            </w:r>
-            <w:r>
-              <w:rPr>
-                <w:color w:val="000000" w:themeColor="text1"/>
-                <w:sz w:val="22"/>
-                <w:szCs w:val="22"/>
-              </w:rPr>
-              <w:t>.</w:t>
-            </w:r>
-            <w:r>
-              <w:rPr>
-                <w:color w:val="000000" w:themeColor="text1"/>
-                <w:sz w:val="22"/>
-                <w:szCs w:val="22"/>
-              </w:rPr>
-              <w:t>00</w:t>
+              <w:t>08.00</w:t>
             </w:r>
           </w:p>
         </w:tc>
@@ -1448,15 +2884,7 @@
                 <w:sz w:val="22"/>
                 <w:szCs w:val="22"/>
               </w:rPr>
-              <w:t>09</w:t>
-            </w:r>
-            <w:r>
-              <w:rPr>
-                <w:color w:val="000000" w:themeColor="text1"/>
-                <w:sz w:val="22"/>
-                <w:szCs w:val="22"/>
-              </w:rPr>
-              <w:t>.00</w:t>
+              <w:t>09.00</w:t>
             </w:r>
           </w:p>
         </w:tc>
@@ -1663,6 +3091,14 @@
                 <w:szCs w:val="22"/>
               </w:rPr>
             </w:pPr>
+            <w:r>
+              <w:rPr>
+                <w:color w:val="000000" w:themeColor="text1"/>
+                <w:sz w:val="22"/>
+                <w:szCs w:val="22"/>
+              </w:rPr>
+              <w:t>23.30</w:t>
+            </w:r>
           </w:p>
         </w:tc>
         <w:tc>
@@ -1678,6 +3114,14 @@
                 <w:szCs w:val="22"/>
               </w:rPr>
             </w:pPr>
+            <w:r>
+              <w:rPr>
+                <w:color w:val="000000" w:themeColor="text1"/>
+                <w:sz w:val="22"/>
+                <w:szCs w:val="22"/>
+              </w:rPr>
+              <w:t>8.00</w:t>
+            </w:r>
           </w:p>
         </w:tc>
         <w:tc>
@@ -1693,6 +3137,14 @@
                 <w:szCs w:val="22"/>
               </w:rPr>
             </w:pPr>
+            <w:r>
+              <w:rPr>
+                <w:color w:val="000000" w:themeColor="text1"/>
+                <w:sz w:val="22"/>
+                <w:szCs w:val="22"/>
+              </w:rPr>
+              <w:t>8.30</w:t>
+            </w:r>
           </w:p>
         </w:tc>
       </w:tr>
@@ -1712,7 +3164,6 @@
                 <w:sz w:val="19"/>
                 <w:szCs w:val="19"/>
               </w:rPr>
-              <w:lastRenderedPageBreak/>
               <w:t>Cumartesi</w:t>
             </w:r>
           </w:p>
@@ -1730,6 +3181,14 @@
                 <w:szCs w:val="22"/>
               </w:rPr>
             </w:pPr>
+            <w:r>
+              <w:rPr>
+                <w:color w:val="000000" w:themeColor="text1"/>
+                <w:sz w:val="22"/>
+                <w:szCs w:val="22"/>
+              </w:rPr>
+              <w:t>24.00</w:t>
+            </w:r>
           </w:p>
         </w:tc>
         <w:tc>
@@ -1745,6 +3204,22 @@
                 <w:szCs w:val="22"/>
               </w:rPr>
             </w:pPr>
+            <w:r>
+              <w:rPr>
+                <w:color w:val="000000" w:themeColor="text1"/>
+                <w:sz w:val="22"/>
+                <w:szCs w:val="22"/>
+              </w:rPr>
+              <w:t>8</w:t>
+            </w:r>
+            <w:r>
+              <w:rPr>
+                <w:color w:val="000000" w:themeColor="text1"/>
+                <w:sz w:val="22"/>
+                <w:szCs w:val="22"/>
+              </w:rPr>
+              <w:t>.00</w:t>
+            </w:r>
           </w:p>
         </w:tc>
         <w:tc>
@@ -1760,6 +3235,14 @@
                 <w:szCs w:val="22"/>
               </w:rPr>
             </w:pPr>
+            <w:r>
+              <w:rPr>
+                <w:color w:val="000000" w:themeColor="text1"/>
+                <w:sz w:val="22"/>
+                <w:szCs w:val="22"/>
+              </w:rPr>
+              <w:t>8.00</w:t>
+            </w:r>
           </w:p>
         </w:tc>
       </w:tr>
@@ -1853,14 +3336,20 @@
         <w:pStyle w:val="Balk1"/>
         <w:spacing w:before="300" w:after="150"/>
         <w:rPr>
-          <w:sz w:val="22"/>
-          <w:szCs w:val="22"/>
-        </w:rPr>
-      </w:pPr>
-      <w:r>
-        <w:rPr>
-          <w:sz w:val="22"/>
-          <w:szCs w:val="22"/>
+          <w:b/>
+          <w:bCs/>
+          <w:color w:val="000000" w:themeColor="text1"/>
+          <w:sz w:val="28"/>
+          <w:szCs w:val="28"/>
+        </w:rPr>
+      </w:pPr>
+      <w:r>
+        <w:rPr>
+          <w:b/>
+          <w:bCs/>
+          <w:color w:val="000000" w:themeColor="text1"/>
+          <w:sz w:val="28"/>
+          <w:szCs w:val="28"/>
         </w:rPr>
         <w:t>5. Nerede Zorlandım ve Takıldım</w:t>
       </w:r>
@@ -1879,14 +3368,20 @@
         <w:pStyle w:val="Balk1"/>
         <w:spacing w:before="300" w:after="150"/>
         <w:rPr>
-          <w:sz w:val="22"/>
-          <w:szCs w:val="22"/>
-        </w:rPr>
-      </w:pPr>
-      <w:r>
-        <w:rPr>
-          <w:sz w:val="22"/>
-          <w:szCs w:val="22"/>
+          <w:b/>
+          <w:bCs/>
+          <w:color w:val="000000" w:themeColor="text1"/>
+          <w:sz w:val="28"/>
+          <w:szCs w:val="28"/>
+        </w:rPr>
+      </w:pPr>
+      <w:r>
+        <w:rPr>
+          <w:b/>
+          <w:bCs/>
+          <w:color w:val="000000" w:themeColor="text1"/>
+          <w:sz w:val="28"/>
+          <w:szCs w:val="28"/>
         </w:rPr>
         <w:t>6. Haftalık Genel Değerlendirme</w:t>
       </w:r>
@@ -1904,32 +3399,22 @@
       <w:pPr>
         <w:spacing w:after="100"/>
         <w:rPr>
-          <w:sz w:val="22"/>
-          <w:szCs w:val="22"/>
-        </w:rPr>
-      </w:pPr>
-      <w:r>
-        <w:rPr>
-          <w:sz w:val="22"/>
-          <w:szCs w:val="22"/>
-        </w:rPr>
-        <w:t xml:space="preserve">Tarih: </w:t>
-      </w:r>
-      <w:proofErr w:type="gramStart"/>
-      <w:r>
-        <w:rPr>
-          <w:sz w:val="22"/>
-          <w:szCs w:val="22"/>
-        </w:rPr>
-        <w:t>24.08.2026 -</w:t>
-      </w:r>
-      <w:proofErr w:type="gramEnd"/>
-      <w:r>
-        <w:rPr>
-          <w:sz w:val="22"/>
-          <w:szCs w:val="22"/>
-        </w:rPr>
-        <w:t xml:space="preserve"> 30.08.2026</w:t>
+          <w:b/>
+          <w:bCs/>
+          <w:color w:val="000000" w:themeColor="text1"/>
+          <w:sz w:val="22"/>
+          <w:szCs w:val="22"/>
+        </w:rPr>
+      </w:pPr>
+      <w:r>
+        <w:rPr>
+          <w:b/>
+          <w:bCs/>
+          <w:color w:val="000000" w:themeColor="text1"/>
+          <w:sz w:val="22"/>
+          <w:szCs w:val="22"/>
+        </w:rPr>
+        <w:t>Tarih: 24.08.2026 - 30.08.2026</w:t>
       </w:r>
     </w:p>
     <w:sectPr>
@@ -2030,11 +3515,103 @@
       </w:pPr>
     </w:lvl>
   </w:abstractNum>
+  <w:abstractNum w:abstractNumId="1" w15:restartNumberingAfterBreak="0">
+    <w:nsid w:val="51475ABC"/>
+    <w:multiLevelType w:val="hybridMultilevel"/>
+    <w:tmpl w:val="B1F2FE46"/>
+    <w:lvl w:ilvl="0" w:tplc="041F000F">
+      <w:start w:val="1"/>
+      <w:numFmt w:val="decimal"/>
+      <w:lvlText w:val="%1."/>
+      <w:lvlJc w:val="left"/>
+      <w:pPr>
+        <w:ind w:left="720" w:hanging="360"/>
+      </w:pPr>
+      <w:rPr>
+        <w:rFonts w:hint="default"/>
+      </w:rPr>
+    </w:lvl>
+    <w:lvl w:ilvl="1" w:tplc="041F0019" w:tentative="1">
+      <w:start w:val="1"/>
+      <w:numFmt w:val="lowerLetter"/>
+      <w:lvlText w:val="%2."/>
+      <w:lvlJc w:val="left"/>
+      <w:pPr>
+        <w:ind w:left="1440" w:hanging="360"/>
+      </w:pPr>
+    </w:lvl>
+    <w:lvl w:ilvl="2" w:tplc="041F001B" w:tentative="1">
+      <w:start w:val="1"/>
+      <w:numFmt w:val="lowerRoman"/>
+      <w:lvlText w:val="%3."/>
+      <w:lvlJc w:val="right"/>
+      <w:pPr>
+        <w:ind w:left="2160" w:hanging="180"/>
+      </w:pPr>
+    </w:lvl>
+    <w:lvl w:ilvl="3" w:tplc="041F000F" w:tentative="1">
+      <w:start w:val="1"/>
+      <w:numFmt w:val="decimal"/>
+      <w:lvlText w:val="%4."/>
+      <w:lvlJc w:val="left"/>
+      <w:pPr>
+        <w:ind w:left="2880" w:hanging="360"/>
+      </w:pPr>
+    </w:lvl>
+    <w:lvl w:ilvl="4" w:tplc="041F0019" w:tentative="1">
+      <w:start w:val="1"/>
+      <w:numFmt w:val="lowerLetter"/>
+      <w:lvlText w:val="%5."/>
+      <w:lvlJc w:val="left"/>
+      <w:pPr>
+        <w:ind w:left="3600" w:hanging="360"/>
+      </w:pPr>
+    </w:lvl>
+    <w:lvl w:ilvl="5" w:tplc="041F001B" w:tentative="1">
+      <w:start w:val="1"/>
+      <w:numFmt w:val="lowerRoman"/>
+      <w:lvlText w:val="%6."/>
+      <w:lvlJc w:val="right"/>
+      <w:pPr>
+        <w:ind w:left="4320" w:hanging="180"/>
+      </w:pPr>
+    </w:lvl>
+    <w:lvl w:ilvl="6" w:tplc="041F000F" w:tentative="1">
+      <w:start w:val="1"/>
+      <w:numFmt w:val="decimal"/>
+      <w:lvlText w:val="%7."/>
+      <w:lvlJc w:val="left"/>
+      <w:pPr>
+        <w:ind w:left="5040" w:hanging="360"/>
+      </w:pPr>
+    </w:lvl>
+    <w:lvl w:ilvl="7" w:tplc="041F0019" w:tentative="1">
+      <w:start w:val="1"/>
+      <w:numFmt w:val="lowerLetter"/>
+      <w:lvlText w:val="%8."/>
+      <w:lvlJc w:val="left"/>
+      <w:pPr>
+        <w:ind w:left="5760" w:hanging="360"/>
+      </w:pPr>
+    </w:lvl>
+    <w:lvl w:ilvl="8" w:tplc="041F001B" w:tentative="1">
+      <w:start w:val="1"/>
+      <w:numFmt w:val="lowerRoman"/>
+      <w:lvlText w:val="%9."/>
+      <w:lvlJc w:val="right"/>
+      <w:pPr>
+        <w:ind w:left="6480" w:hanging="180"/>
+      </w:pPr>
+    </w:lvl>
+  </w:abstractNum>
   <w:num w:numId="1" w16cid:durableId="1421486833">
     <w:abstractNumId w:val="0"/>
     <w:lvlOverride w:ilvl="0">
       <w:startOverride w:val="1"/>
     </w:lvlOverride>
+  </w:num>
+  <w:num w:numId="2" w16cid:durableId="372845409">
+    <w:abstractNumId w:val="1"/>
   </w:num>
 </w:numbering>
 </file>
@@ -2518,7 +4095,6 @@
   <w:style w:type="character" w:default="1" w:styleId="VarsaylanParagrafYazTipi">
     <w:name w:val="Default Paragraph Font"/>
     <w:uiPriority w:val="1"/>
-    <w:semiHidden/>
     <w:unhideWhenUsed/>
   </w:style>
   <w:style w:type="table" w:default="1" w:styleId="NormalTablo">
@@ -2649,6 +4225,18 @@
         <w:insideV w:val="single" w:sz="4" w:space="0" w:color="auto"/>
       </w:tblBorders>
     </w:tblPr>
+  </w:style>
+  <w:style w:type="character" w:styleId="zmlenmeyenBahsetme">
+    <w:name w:val="Unresolved Mention"/>
+    <w:basedOn w:val="VarsaylanParagrafYazTipi"/>
+    <w:uiPriority w:val="99"/>
+    <w:semiHidden/>
+    <w:unhideWhenUsed/>
+    <w:rsid w:val="00E235BA"/>
+    <w:rPr>
+      <w:color w:val="605E5C"/>
+      <w:shd w:val="clear" w:color="auto" w:fill="E1DFDD"/>
+    </w:rPr>
   </w:style>
 </w:styles>
 </file>

</xml_diff>

<commit_message>
docs: Ay 2 - 1. Hafta raporu tamamlandı
</commit_message>
<xml_diff>
--- a/Ay2_Hafta1_Rapor.docx
+++ b/Ay2_Hafta1_Rapor.docx
@@ -70,17 +70,7 @@
           <w:sz w:val="22"/>
           <w:szCs w:val="22"/>
         </w:rPr>
-        <w:t>Pazartes</w:t>
-      </w:r>
-      <w:r>
-        <w:rPr>
-          <w:b/>
-          <w:bCs/>
-          <w:color w:val="000000" w:themeColor="text1"/>
-          <w:sz w:val="22"/>
-          <w:szCs w:val="22"/>
-        </w:rPr>
-        <w:t>i-Salı</w:t>
+        <w:t>Pazartesi-Salı</w:t>
       </w:r>
     </w:p>
     <w:p>
@@ -220,17 +210,7 @@
           <w:sz w:val="22"/>
           <w:szCs w:val="22"/>
         </w:rPr>
-        <w:t>Çarşamba</w:t>
-      </w:r>
-      <w:r>
-        <w:rPr>
-          <w:b/>
-          <w:bCs/>
-          <w:color w:val="000000" w:themeColor="text1"/>
-          <w:sz w:val="22"/>
-          <w:szCs w:val="22"/>
-        </w:rPr>
-        <w:t>-Perşembe</w:t>
+        <w:t>Çarşamba-Perşembe</w:t>
       </w:r>
     </w:p>
     <w:p>
@@ -987,7 +967,7 @@
           <w:sz w:val="28"/>
           <w:szCs w:val="28"/>
         </w:rPr>
-        <w:t>2. L</w:t>
+        <w:t xml:space="preserve">2. </w:t>
       </w:r>
       <w:proofErr w:type="spellStart"/>
       <w:r>
@@ -998,7 +978,7 @@
           <w:sz w:val="28"/>
           <w:szCs w:val="28"/>
         </w:rPr>
-        <w:t>eetCode</w:t>
+        <w:t>LeetCode</w:t>
       </w:r>
       <w:proofErr w:type="spellEnd"/>
       <w:r>
@@ -1434,7 +1414,7 @@
           <w:sz w:val="22"/>
           <w:szCs w:val="22"/>
         </w:rPr>
-        <w:t xml:space="preserve"> — </w:t>
+        <w:t xml:space="preserve"> </w:t>
       </w:r>
       <w:proofErr w:type="spellStart"/>
       <w:r>
@@ -1491,7 +1471,7 @@
           <w:sz w:val="22"/>
           <w:szCs w:val="22"/>
         </w:rPr>
-        <w:t xml:space="preserve"> — Girdi boyutundan bağımsız olarak sadece iki sayaç değişkeni ve sabit boyutlu bir sonuç listesi tutuluyor.</w:t>
+        <w:t xml:space="preserve"> Girdi boyutundan bağımsız olarak sadece iki sayaç değişkeni ve sabit boyutlu bir sonuç listesi tutuluyor.</w:t>
       </w:r>
     </w:p>
     <w:p>
@@ -3279,6 +3259,14 @@
                 <w:szCs w:val="22"/>
               </w:rPr>
             </w:pPr>
+            <w:r>
+              <w:rPr>
+                <w:color w:val="000000" w:themeColor="text1"/>
+                <w:sz w:val="22"/>
+                <w:szCs w:val="22"/>
+              </w:rPr>
+              <w:t>24.00</w:t>
+            </w:r>
           </w:p>
         </w:tc>
         <w:tc>
@@ -3294,6 +3282,14 @@
                 <w:szCs w:val="22"/>
               </w:rPr>
             </w:pPr>
+            <w:r>
+              <w:rPr>
+                <w:color w:val="000000" w:themeColor="text1"/>
+                <w:sz w:val="22"/>
+                <w:szCs w:val="22"/>
+              </w:rPr>
+              <w:t>9.30</w:t>
+            </w:r>
           </w:p>
         </w:tc>
         <w:tc>
@@ -3309,6 +3305,14 @@
                 <w:szCs w:val="22"/>
               </w:rPr>
             </w:pPr>
+            <w:r>
+              <w:rPr>
+                <w:color w:val="000000" w:themeColor="text1"/>
+                <w:sz w:val="22"/>
+                <w:szCs w:val="22"/>
+              </w:rPr>
+              <w:t>9.30</w:t>
+            </w:r>
           </w:p>
         </w:tc>
       </w:tr>
@@ -3330,6 +3334,23 @@
           <w:szCs w:val="22"/>
         </w:rPr>
       </w:pPr>
+      <w:r>
+        <w:rPr>
+          <w:sz w:val="22"/>
+          <w:szCs w:val="22"/>
+        </w:rPr>
+        <w:t>Ortalama:</w:t>
+      </w:r>
+      <w:r>
+        <w:t xml:space="preserve"> </w:t>
+      </w:r>
+      <w:r>
+        <w:rPr>
+          <w:sz w:val="22"/>
+          <w:szCs w:val="22"/>
+        </w:rPr>
+        <w:t>8 saat 26 dakika</w:t>
+      </w:r>
     </w:p>
     <w:p>
       <w:pPr>
@@ -3356,26 +3377,225 @@
     </w:p>
     <w:p>
       <w:pPr>
-        <w:spacing w:after="100"/>
-        <w:rPr>
-          <w:sz w:val="22"/>
-          <w:szCs w:val="22"/>
-        </w:rPr>
-      </w:pPr>
-    </w:p>
-    <w:p>
-      <w:pPr>
         <w:pStyle w:val="Balk1"/>
         <w:spacing w:before="300" w:after="150"/>
         <w:rPr>
+          <w:color w:val="000000" w:themeColor="text1"/>
+          <w:sz w:val="22"/>
+          <w:szCs w:val="22"/>
+        </w:rPr>
+      </w:pPr>
+      <w:r>
+        <w:rPr>
           <w:b/>
           <w:bCs/>
           <w:color w:val="000000" w:themeColor="text1"/>
           <w:sz w:val="28"/>
           <w:szCs w:val="28"/>
         </w:rPr>
-      </w:pPr>
-      <w:r>
+        <w:t xml:space="preserve">    </w:t>
+      </w:r>
+      <w:proofErr w:type="spellStart"/>
+      <w:r>
+        <w:rPr>
+          <w:color w:val="000000" w:themeColor="text1"/>
+          <w:sz w:val="22"/>
+          <w:szCs w:val="22"/>
+        </w:rPr>
+        <w:t>Commit</w:t>
+      </w:r>
+      <w:proofErr w:type="spellEnd"/>
+      <w:r>
+        <w:rPr>
+          <w:color w:val="000000" w:themeColor="text1"/>
+          <w:sz w:val="22"/>
+          <w:szCs w:val="22"/>
+        </w:rPr>
+        <w:t xml:space="preserve"> mesajlarını düzenlerken hangi </w:t>
+      </w:r>
+      <w:r>
+        <w:rPr>
+          <w:color w:val="000000" w:themeColor="text1"/>
+          <w:sz w:val="22"/>
+          <w:szCs w:val="22"/>
+        </w:rPr>
+        <w:t>ifadeyi (</w:t>
+      </w:r>
+      <w:proofErr w:type="spellStart"/>
+      <w:r>
+        <w:rPr>
+          <w:color w:val="000000" w:themeColor="text1"/>
+          <w:sz w:val="22"/>
+          <w:szCs w:val="22"/>
+        </w:rPr>
+        <w:t>fix</w:t>
+      </w:r>
+      <w:proofErr w:type="spellEnd"/>
+      <w:r>
+        <w:rPr>
+          <w:color w:val="000000" w:themeColor="text1"/>
+          <w:sz w:val="22"/>
+          <w:szCs w:val="22"/>
+        </w:rPr>
+        <w:t xml:space="preserve"> mi, </w:t>
+      </w:r>
+      <w:proofErr w:type="spellStart"/>
+      <w:r>
+        <w:rPr>
+          <w:color w:val="000000" w:themeColor="text1"/>
+          <w:sz w:val="22"/>
+          <w:szCs w:val="22"/>
+        </w:rPr>
+        <w:t>refactor</w:t>
+      </w:r>
+      <w:proofErr w:type="spellEnd"/>
+      <w:r>
+        <w:rPr>
+          <w:color w:val="000000" w:themeColor="text1"/>
+          <w:sz w:val="22"/>
+          <w:szCs w:val="22"/>
+        </w:rPr>
+        <w:t xml:space="preserve"> mü, </w:t>
+      </w:r>
+      <w:proofErr w:type="spellStart"/>
+      <w:r>
+        <w:rPr>
+          <w:color w:val="000000" w:themeColor="text1"/>
+          <w:sz w:val="22"/>
+          <w:szCs w:val="22"/>
+        </w:rPr>
+        <w:t>feat</w:t>
+      </w:r>
+      <w:proofErr w:type="spellEnd"/>
+      <w:r>
+        <w:rPr>
+          <w:color w:val="000000" w:themeColor="text1"/>
+          <w:sz w:val="22"/>
+          <w:szCs w:val="22"/>
+        </w:rPr>
+        <w:t xml:space="preserve"> mi) kullanmam gerektiğini bazı durumlarda kafam karıştı ve bu durumlarda kaynak araştırıp </w:t>
+      </w:r>
+      <w:proofErr w:type="spellStart"/>
+      <w:r>
+        <w:rPr>
+          <w:color w:val="000000" w:themeColor="text1"/>
+          <w:sz w:val="22"/>
+          <w:szCs w:val="22"/>
+        </w:rPr>
+        <w:t>conventional</w:t>
+      </w:r>
+      <w:proofErr w:type="spellEnd"/>
+      <w:r>
+        <w:rPr>
+          <w:color w:val="000000" w:themeColor="text1"/>
+          <w:sz w:val="22"/>
+          <w:szCs w:val="22"/>
+        </w:rPr>
+        <w:t xml:space="preserve"> </w:t>
+      </w:r>
+      <w:proofErr w:type="spellStart"/>
+      <w:r>
+        <w:rPr>
+          <w:color w:val="000000" w:themeColor="text1"/>
+          <w:sz w:val="22"/>
+          <w:szCs w:val="22"/>
+        </w:rPr>
+        <w:t>commit</w:t>
+      </w:r>
+      <w:proofErr w:type="spellEnd"/>
+      <w:r>
+        <w:rPr>
+          <w:color w:val="000000" w:themeColor="text1"/>
+          <w:sz w:val="22"/>
+          <w:szCs w:val="22"/>
+        </w:rPr>
+        <w:t xml:space="preserve"> örneklerine bakarak doğru formatı bulmaya çalıştım.</w:t>
+      </w:r>
+      <w:r>
+        <w:rPr>
+          <w:color w:val="000000" w:themeColor="text1"/>
+          <w:sz w:val="22"/>
+          <w:szCs w:val="22"/>
+        </w:rPr>
+        <w:tab/>
+      </w:r>
+    </w:p>
+    <w:p>
+      <w:pPr>
+        <w:pStyle w:val="Balk1"/>
+        <w:spacing w:before="300" w:after="150"/>
+        <w:rPr>
+          <w:color w:val="000000" w:themeColor="text1"/>
+          <w:sz w:val="22"/>
+          <w:szCs w:val="22"/>
+        </w:rPr>
+      </w:pPr>
+      <w:r>
+        <w:rPr>
+          <w:color w:val="000000" w:themeColor="text1"/>
+          <w:sz w:val="22"/>
+          <w:szCs w:val="22"/>
+        </w:rPr>
+        <w:t xml:space="preserve">     </w:t>
+      </w:r>
+      <w:r>
+        <w:rPr>
+          <w:color w:val="000000" w:themeColor="text1"/>
+          <w:sz w:val="22"/>
+          <w:szCs w:val="22"/>
+        </w:rPr>
+        <w:t>Ayrıca eski kayıtlı veri dosyamla (</w:t>
+      </w:r>
+      <w:proofErr w:type="spellStart"/>
+      <w:r>
+        <w:rPr>
+          <w:color w:val="000000" w:themeColor="text1"/>
+          <w:sz w:val="22"/>
+          <w:szCs w:val="22"/>
+        </w:rPr>
+        <w:t>gorevler.json</w:t>
+      </w:r>
+      <w:proofErr w:type="spellEnd"/>
+      <w:r>
+        <w:rPr>
+          <w:color w:val="000000" w:themeColor="text1"/>
+          <w:sz w:val="22"/>
+          <w:szCs w:val="22"/>
+        </w:rPr>
+        <w:t xml:space="preserve">) güncellediğim kod uyuşmadığı için </w:t>
+      </w:r>
+      <w:proofErr w:type="spellStart"/>
+      <w:r>
+        <w:rPr>
+          <w:color w:val="000000" w:themeColor="text1"/>
+          <w:sz w:val="22"/>
+          <w:szCs w:val="22"/>
+        </w:rPr>
+        <w:t>KeyError</w:t>
+      </w:r>
+      <w:proofErr w:type="spellEnd"/>
+      <w:r>
+        <w:rPr>
+          <w:color w:val="000000" w:themeColor="text1"/>
+          <w:sz w:val="22"/>
+          <w:szCs w:val="22"/>
+        </w:rPr>
+        <w:t xml:space="preserve"> hatası aldım; bunun sebebinin kodda değil, veri formatındaki eski isimlendirmede olduğunu anlamak biraz zaman aldı. </w:t>
+      </w:r>
+    </w:p>
+    <w:p>
+      <w:pPr>
+        <w:spacing w:after="100"/>
+        <w:rPr>
+          <w:sz w:val="22"/>
+          <w:szCs w:val="22"/>
+        </w:rPr>
+      </w:pPr>
+    </w:p>
+    <w:p>
+      <w:pPr>
+        <w:pStyle w:val="Balk1"/>
+        <w:spacing w:before="300" w:after="150"/>
         <w:rPr>
           <w:b/>
           <w:bCs/>
@@ -3383,7 +3603,264 @@
           <w:sz w:val="28"/>
           <w:szCs w:val="28"/>
         </w:rPr>
+      </w:pPr>
+      <w:r>
+        <w:rPr>
+          <w:b/>
+          <w:bCs/>
+          <w:color w:val="000000" w:themeColor="text1"/>
+          <w:sz w:val="28"/>
+          <w:szCs w:val="28"/>
+        </w:rPr>
         <w:t>6. Haftalık Genel Değerlendirme</w:t>
+      </w:r>
+    </w:p>
+    <w:p>
+      <w:pPr>
+        <w:pStyle w:val="Balk1"/>
+        <w:spacing w:before="300" w:after="150"/>
+        <w:jc w:val="both"/>
+        <w:rPr>
+          <w:color w:val="000000" w:themeColor="text1"/>
+          <w:sz w:val="22"/>
+          <w:szCs w:val="22"/>
+        </w:rPr>
+      </w:pPr>
+      <w:r>
+        <w:rPr>
+          <w:color w:val="000000" w:themeColor="text1"/>
+          <w:sz w:val="22"/>
+          <w:szCs w:val="22"/>
+        </w:rPr>
+        <w:t xml:space="preserve">    </w:t>
+      </w:r>
+      <w:r>
+        <w:rPr>
+          <w:color w:val="000000" w:themeColor="text1"/>
+          <w:sz w:val="22"/>
+          <w:szCs w:val="22"/>
+        </w:rPr>
+        <w:t>Bu hafta Ay 2 planındaki 5 görevin tamamını tamamladım</w:t>
+      </w:r>
+      <w:r>
+        <w:rPr>
+          <w:color w:val="000000" w:themeColor="text1"/>
+          <w:sz w:val="22"/>
+          <w:szCs w:val="22"/>
+        </w:rPr>
+        <w:t xml:space="preserve">. </w:t>
+      </w:r>
+      <w:proofErr w:type="spellStart"/>
+      <w:r>
+        <w:rPr>
+          <w:color w:val="000000" w:themeColor="text1"/>
+          <w:sz w:val="22"/>
+          <w:szCs w:val="22"/>
+        </w:rPr>
+        <w:t>C</w:t>
+      </w:r>
+      <w:r>
+        <w:rPr>
+          <w:color w:val="000000" w:themeColor="text1"/>
+          <w:sz w:val="22"/>
+          <w:szCs w:val="22"/>
+        </w:rPr>
+        <w:t>ommit</w:t>
+      </w:r>
+      <w:r>
+        <w:rPr>
+          <w:color w:val="000000" w:themeColor="text1"/>
+          <w:sz w:val="22"/>
+          <w:szCs w:val="22"/>
+        </w:rPr>
+        <w:t>leri</w:t>
+      </w:r>
+      <w:proofErr w:type="spellEnd"/>
+      <w:r>
+        <w:rPr>
+          <w:color w:val="000000" w:themeColor="text1"/>
+          <w:sz w:val="22"/>
+          <w:szCs w:val="22"/>
+        </w:rPr>
+        <w:t xml:space="preserve"> standartlar</w:t>
+      </w:r>
+      <w:r>
+        <w:rPr>
+          <w:color w:val="000000" w:themeColor="text1"/>
+          <w:sz w:val="22"/>
+          <w:szCs w:val="22"/>
+        </w:rPr>
+        <w:t>a göre ayarladım</w:t>
+      </w:r>
+      <w:r>
+        <w:rPr>
+          <w:color w:val="000000" w:themeColor="text1"/>
+          <w:sz w:val="22"/>
+          <w:szCs w:val="22"/>
+        </w:rPr>
+        <w:t>, Python mini projesinde 5 farklı kod kalitesi iyileştirmesi</w:t>
+      </w:r>
+      <w:r>
+        <w:rPr>
+          <w:color w:val="000000" w:themeColor="text1"/>
+          <w:sz w:val="22"/>
+          <w:szCs w:val="22"/>
+        </w:rPr>
+        <w:t>ni yaptım. İlk ay programında eksik olduğum kısımları tamamladım ikinci ay için iyi bir başlangıç yaptım</w:t>
+      </w:r>
+      <w:r>
+        <w:rPr>
+          <w:color w:val="000000" w:themeColor="text1"/>
+          <w:sz w:val="22"/>
+          <w:szCs w:val="22"/>
+        </w:rPr>
+        <w:t xml:space="preserve">. </w:t>
+      </w:r>
+      <w:r>
+        <w:rPr>
+          <w:color w:val="000000" w:themeColor="text1"/>
+          <w:sz w:val="22"/>
+          <w:szCs w:val="22"/>
+        </w:rPr>
+        <w:t xml:space="preserve">Bunlara ek olarak </w:t>
+      </w:r>
+      <w:proofErr w:type="spellStart"/>
+      <w:r>
+        <w:rPr>
+          <w:color w:val="000000" w:themeColor="text1"/>
+          <w:sz w:val="22"/>
+          <w:szCs w:val="22"/>
+        </w:rPr>
+        <w:t>Clean</w:t>
+      </w:r>
+      <w:proofErr w:type="spellEnd"/>
+      <w:r>
+        <w:rPr>
+          <w:color w:val="000000" w:themeColor="text1"/>
+          <w:sz w:val="22"/>
+          <w:szCs w:val="22"/>
+        </w:rPr>
+        <w:t xml:space="preserve"> </w:t>
+      </w:r>
+      <w:proofErr w:type="spellStart"/>
+      <w:r>
+        <w:rPr>
+          <w:color w:val="000000" w:themeColor="text1"/>
+          <w:sz w:val="22"/>
+          <w:szCs w:val="22"/>
+        </w:rPr>
+        <w:t>Code</w:t>
+      </w:r>
+      <w:proofErr w:type="spellEnd"/>
+      <w:r>
+        <w:rPr>
+          <w:color w:val="000000" w:themeColor="text1"/>
+          <w:sz w:val="22"/>
+          <w:szCs w:val="22"/>
+        </w:rPr>
+        <w:t xml:space="preserve"> kitabının önsözünü okuyup özetledim, bir teknik makale inceledim ve iki </w:t>
+      </w:r>
+      <w:proofErr w:type="spellStart"/>
+      <w:r>
+        <w:rPr>
+          <w:color w:val="000000" w:themeColor="text1"/>
+          <w:sz w:val="22"/>
+          <w:szCs w:val="22"/>
+        </w:rPr>
+        <w:t>LeetCode</w:t>
+      </w:r>
+      <w:proofErr w:type="spellEnd"/>
+      <w:r>
+        <w:rPr>
+          <w:color w:val="000000" w:themeColor="text1"/>
+          <w:sz w:val="22"/>
+          <w:szCs w:val="22"/>
+        </w:rPr>
+        <w:t xml:space="preserve"> </w:t>
+      </w:r>
+      <w:proofErr w:type="spellStart"/>
+      <w:r>
+        <w:rPr>
+          <w:color w:val="000000" w:themeColor="text1"/>
+          <w:sz w:val="22"/>
+          <w:szCs w:val="22"/>
+        </w:rPr>
+        <w:t>Easy</w:t>
+      </w:r>
+      <w:proofErr w:type="spellEnd"/>
+      <w:r>
+        <w:rPr>
+          <w:color w:val="000000" w:themeColor="text1"/>
+          <w:sz w:val="22"/>
+          <w:szCs w:val="22"/>
+        </w:rPr>
+        <w:t xml:space="preserve"> problemi çözerek </w:t>
+      </w:r>
+      <w:proofErr w:type="spellStart"/>
+      <w:r>
+        <w:rPr>
+          <w:color w:val="000000" w:themeColor="text1"/>
+          <w:sz w:val="22"/>
+          <w:szCs w:val="22"/>
+        </w:rPr>
+        <w:t>Big</w:t>
+      </w:r>
+      <w:proofErr w:type="spellEnd"/>
+      <w:r>
+        <w:rPr>
+          <w:color w:val="000000" w:themeColor="text1"/>
+          <w:sz w:val="22"/>
+          <w:szCs w:val="22"/>
+        </w:rPr>
+        <w:t>-O analizlerini yaptım.</w:t>
+      </w:r>
+      <w:r>
+        <w:rPr>
+          <w:color w:val="auto"/>
+          <w:sz w:val="20"/>
+          <w:szCs w:val="20"/>
+        </w:rPr>
+        <w:t xml:space="preserve"> </w:t>
+      </w:r>
+      <w:r>
+        <w:rPr>
+          <w:color w:val="000000" w:themeColor="text1"/>
+          <w:sz w:val="22"/>
+          <w:szCs w:val="22"/>
+        </w:rPr>
+        <w:t>Gelecek hafta için hedefim, bu ilkeleri yeni yazacağım kodlara baştan uygulamak</w:t>
+      </w:r>
+      <w:r>
+        <w:rPr>
+          <w:color w:val="000000" w:themeColor="text1"/>
+          <w:sz w:val="22"/>
+          <w:szCs w:val="22"/>
+        </w:rPr>
+        <w:t>.</w:t>
+      </w:r>
+      <w:r>
+        <w:rPr>
+          <w:color w:val="auto"/>
+          <w:sz w:val="20"/>
+          <w:szCs w:val="20"/>
+        </w:rPr>
+        <w:t xml:space="preserve"> </w:t>
+      </w:r>
+      <w:r>
+        <w:rPr>
+          <w:color w:val="000000" w:themeColor="text1"/>
+          <w:sz w:val="22"/>
+          <w:szCs w:val="22"/>
+        </w:rPr>
+        <w:t>Y</w:t>
+      </w:r>
+      <w:r>
+        <w:rPr>
+          <w:color w:val="000000" w:themeColor="text1"/>
+          <w:sz w:val="22"/>
+          <w:szCs w:val="22"/>
+        </w:rPr>
+        <w:t>ani bir hatayı sonradan fark edip düzeltmek yerine, en başından doğru ve temiz yazmayı alışkanlık haline getirmek.</w:t>
       </w:r>
     </w:p>
     <w:p>
@@ -4095,6 +4572,7 @@
   <w:style w:type="character" w:default="1" w:styleId="VarsaylanParagrafYazTipi">
     <w:name w:val="Default Paragraph Font"/>
     <w:uiPriority w:val="1"/>
+    <w:semiHidden/>
     <w:unhideWhenUsed/>
   </w:style>
   <w:style w:type="table" w:default="1" w:styleId="NormalTablo">

</xml_diff>